<commit_message>
Expand glossary into Glossary and Pronunciation Guide
- Add pronunciation guide section (Maori vowels, macrons, diphthongs,
  consonants) before the Core Kupu table
- Add inline pronunciations in brackets to every entry across all four
  tables (Core Kupu, Atua, Peoples/Places, Characters)
- Add 16 new entries: hika, hua, mahoe, miro, moai, moi, otaha, paru,
  patu, rangatahi, taniwha, vokai, whakapapa (Core Kupu); Haronga
  (Atua); Lapita (Peoples/Places)
- Fix 'Patu gone patu' -> 'Patu gone paru' in chapter one
- Update book.json glossaryTitle to match

Co-Authored-By: Claude Sonnet 4.6 <noreply@anthropic.com>
</commit_message>
<xml_diff>
--- a/public/journal/Ho and the Baby Eater - Glossary Publication.docx
+++ b/public/journal/Ho and the Baby Eater - Glossary Publication.docx
@@ -12,7 +12,7 @@
           <w:b/>
           <w:sz w:val="36"/>
         </w:rPr>
-        <w:t>Ho and the Baby Eater: Glossary</w:t>
+        <w:t>Ho and the Baby Eater: Glossary and Pronunciation Guide</w:t>
       </w:r>
     </w:p>
     <w:p>
@@ -64,6 +64,119 @@
       </w:r>
     </w:p>
     <w:p>
+      <w:r>
+        <w:t xml:space="preserve">Generally falls on the first syllable. Macronned vowels draw additional weight wherever they appear.</w:t>
+      </w:r>
+    </w:p>
+    <w:p>
+      <w:pPr>
+        <w:pStyle w:val="Heading2"/>
+      </w:pPr>
+      <w:r>
+        <w:t xml:space="preserve">Stress</w:t>
+      </w:r>
+    </w:p>
+    <w:p>
+      <w:r>
+        <w:t xml:space="preserve">  r — a light flap, closer to the r in Spanish pero than the English r</w:t>
+      </w:r>
+    </w:p>
+    <w:p>
+      <w:r>
+        <w:t xml:space="preserve">  ng — always the sound in singing, never as in finger; it can begin a syllable (e.g., ngeri begins with this nasal)</w:t>
+      </w:r>
+    </w:p>
+    <w:p>
+      <w:r>
+        <w:t xml:space="preserve">  wh — pronounced as f in most Māori dialects (e.g., whakapapa → fah-kah-PAH-pah; whāriki → FAH-ree-kee)</w:t>
+      </w:r>
+    </w:p>
+    <w:p>
+      <w:r>
+        <w:t xml:space="preserve">Mostly close to English, with three key differences:</w:t>
+      </w:r>
+    </w:p>
+    <w:p>
+      <w:pPr>
+        <w:pStyle w:val="Heading2"/>
+      </w:pPr>
+      <w:r>
+        <w:t xml:space="preserve">Consonants</w:t>
+      </w:r>
+    </w:p>
+    <w:p>
+      <w:r>
+        <w:t xml:space="preserve">  ei → eh-ee      oe → oh-eh      oi → oh-ee      ou → oh-oo</w:t>
+      </w:r>
+    </w:p>
+    <w:p>
+      <w:r>
+        <w:t xml:space="preserve">  ae → ah-eh      ai → ah-ee      ao → ah-oh      au → ah-oo</w:t>
+      </w:r>
+    </w:p>
+    <w:p>
+      <w:r>
+        <w:t xml:space="preserve">Two vowels blending smoothly together without a break:</w:t>
+      </w:r>
+    </w:p>
+    <w:p>
+      <w:pPr>
+        <w:pStyle w:val="Heading2"/>
+      </w:pPr>
+      <w:r>
+        <w:t xml:space="preserve">Diphthongs</w:t>
+      </w:r>
+    </w:p>
+    <w:p>
+      <w:r>
+        <w:t xml:space="preserve">The same five vowels held longer. A macron roughly doubles the duration of the vowel without changing its quality: ā is a held “ah,” ō is a held “oh.”</w:t>
+      </w:r>
+    </w:p>
+    <w:p>
+      <w:pPr>
+        <w:pStyle w:val="Heading2"/>
+      </w:pPr>
+      <w:r>
+        <w:t xml:space="preserve">Macrons (ā ē ī ō ū)</w:t>
+      </w:r>
+    </w:p>
+    <w:p>
+      <w:r>
+        <w:t xml:space="preserve">  o — as in core         u — as in moon (short)</w:t>
+      </w:r>
+    </w:p>
+    <w:p>
+      <w:r>
+        <w:t xml:space="preserve">  a — as in father        e — as in bed        i — as in feet (short)</w:t>
+      </w:r>
+    </w:p>
+    <w:p>
+      <w:r>
+        <w:t xml:space="preserve">Five pure sounds, short unless marked with a macron:</w:t>
+      </w:r>
+    </w:p>
+    <w:p>
+      <w:pPr>
+        <w:pStyle w:val="Heading2"/>
+      </w:pPr>
+      <w:r>
+        <w:t xml:space="preserve">Vowels</w:t>
+      </w:r>
+    </w:p>
+    <w:p>
+      <w:r>
+        <w:t xml:space="preserve">Māori and most Polynesian languages share a consistent vowel system. Once the sounds below are learned, any word in this glossary can be sounded out reliably. The pronunciations shown in brackets after each entry use a plain-English respelling: syllables are separated by hyphens and the stressed syllable appears in CAPS.</w:t>
+      </w:r>
+    </w:p>
+    <w:p>
+      <w:pPr>
+        <w:pStyle w:val="Heading1"/>
+      </w:pPr>
+      <w:r>
+        <w:t xml:space="preserve">Pronunciation Guide</w:t>
+      </w:r>
+    </w:p>
+    <w:p>
       <w:pPr>
         <w:pStyle w:val="Heading1"/>
       </w:pPr>
@@ -139,6 +252,9 @@
               </w:rPr>
               <w:t>āe</w:t>
             </w:r>
+            <w:r>
+              <w:t xml:space="preserve"> (ah-EH)</w:t>
+            </w:r>
           </w:p>
         </w:tc>
         <w:tc>
@@ -177,6 +293,9 @@
               </w:rPr>
               <w:t>ariki</w:t>
             </w:r>
+            <w:r>
+              <w:t xml:space="preserve"> (ah-REE-kee)</w:t>
+            </w:r>
           </w:p>
         </w:tc>
         <w:tc>
@@ -215,6 +334,9 @@
               </w:rPr>
               <w:t>atua</w:t>
             </w:r>
+            <w:r>
+              <w:t xml:space="preserve"> (ah-TOO-ah)</w:t>
+            </w:r>
           </w:p>
         </w:tc>
         <w:tc>
@@ -253,6 +375,9 @@
               </w:rPr>
               <w:t>auē</w:t>
             </w:r>
+            <w:r>
+              <w:t xml:space="preserve"> (ow-EH)</w:t>
+            </w:r>
           </w:p>
         </w:tc>
         <w:tc>
@@ -291,6 +416,9 @@
               </w:rPr>
               <w:t>hā</w:t>
             </w:r>
+            <w:r>
+              <w:t xml:space="preserve"> (HAH)</w:t>
+            </w:r>
           </w:p>
         </w:tc>
         <w:tc>
@@ -329,6 +457,9 @@
               </w:rPr>
               <w:t>hapū</w:t>
             </w:r>
+            <w:r>
+              <w:t xml:space="preserve"> (hah-POO)</w:t>
+            </w:r>
           </w:p>
         </w:tc>
         <w:tc>
@@ -367,6 +498,9 @@
               </w:rPr>
               <w:t>harakeke</w:t>
             </w:r>
+            <w:r>
+              <w:t xml:space="preserve"> (hah-rah-KEH-keh)</w:t>
+            </w:r>
           </w:p>
         </w:tc>
         <w:tc>
@@ -399,11 +533,7 @@
               <w:spacing w:after="0"/>
             </w:pPr>
             <w:r>
-              <w:rPr>
-                <w:rFonts w:ascii="Arial" w:hAnsi="Arial"/>
-                <w:sz w:val="17"/>
-              </w:rPr>
-              <w:t>hoe</w:t>
+              <w:t xml:space="preserve">hika (HEE-kah)</w:t>
             </w:r>
           </w:p>
         </w:tc>
@@ -417,11 +547,7 @@
               <w:spacing w:after="0"/>
             </w:pPr>
             <w:r>
-              <w:rPr>
-                <w:rFonts w:ascii="Arial" w:hAnsi="Arial"/>
-                <w:sz w:val="17"/>
-              </w:rPr>
-              <w:t>Paddle; also the action or command to paddle.</w:t>
+              <w:t xml:space="preserve">The act of fire-making by friction; rubbing a hardened pointed stick against a grooved board to generate an ember. Used in the manuscript in the phrase “rub of hika to mahoe.”</w:t>
             </w:r>
           </w:p>
         </w:tc>
@@ -441,7 +567,10 @@
                 <w:rFonts w:ascii="Arial" w:hAnsi="Arial"/>
                 <w:sz w:val="17"/>
               </w:rPr>
-              <w:t>kaihautū</w:t>
+              <w:t>hoe</w:t>
+            </w:r>
+            <w:r>
+              <w:t xml:space="preserve"> (HOH-eh)</w:t>
             </w:r>
           </w:p>
         </w:tc>
@@ -459,7 +588,7 @@
                 <w:rFonts w:ascii="Arial" w:hAnsi="Arial"/>
                 <w:sz w:val="17"/>
               </w:rPr>
-              <w:t>Canoe leader, caller, or timekeeper who helps coordinate paddling and rhythm.</w:t>
+              <w:t>Paddle; also the action or command to paddle.</w:t>
             </w:r>
           </w:p>
         </w:tc>
@@ -475,11 +604,7 @@
               <w:spacing w:after="0"/>
             </w:pPr>
             <w:r>
-              <w:rPr>
-                <w:rFonts w:ascii="Arial" w:hAnsi="Arial"/>
-                <w:sz w:val="17"/>
-              </w:rPr>
-              <w:t>karaka</w:t>
+              <w:t xml:space="preserve">hua (HOO-ah)</w:t>
             </w:r>
           </w:p>
         </w:tc>
@@ -493,11 +618,7 @@
               <w:spacing w:after="0"/>
             </w:pPr>
             <w:r>
-              <w:rPr>
-                <w:rFonts w:ascii="Arial" w:hAnsi="Arial"/>
-                <w:sz w:val="17"/>
-              </w:rPr>
-              <w:t>A coastal tree with glossy leaves and orange fruit.</w:t>
+              <w:t xml:space="preserve">Fruit, produce, result; in wider usage, the yield of any effort. In the manuscript used colloquially for brains or mind: “this cursed island has scooped out my hua—now I’m only the shell.”</w:t>
             </w:r>
           </w:p>
         </w:tc>
@@ -517,7 +638,10 @@
                 <w:rFonts w:ascii="Arial" w:hAnsi="Arial"/>
                 <w:sz w:val="17"/>
               </w:rPr>
-              <w:t>kauri</w:t>
+              <w:t>kaihautū</w:t>
+            </w:r>
+            <w:r>
+              <w:t xml:space="preserve"> (kai-how-TOO)</w:t>
             </w:r>
           </w:p>
         </w:tc>
@@ -535,7 +659,7 @@
                 <w:rFonts w:ascii="Arial" w:hAnsi="Arial"/>
                 <w:sz w:val="17"/>
               </w:rPr>
-              <w:t>Large native forest tree. In the manuscript it can also appear in elevated or personified chant contexts.</w:t>
+              <w:t>Canoe leader, caller, or timekeeper who helps coordinate paddling and rhythm.</w:t>
             </w:r>
           </w:p>
         </w:tc>
@@ -555,7 +679,10 @@
                 <w:rFonts w:ascii="Arial" w:hAnsi="Arial"/>
                 <w:sz w:val="17"/>
               </w:rPr>
-              <w:t>kava</w:t>
+              <w:t>karaka</w:t>
+            </w:r>
+            <w:r>
+              <w:t xml:space="preserve"> (kah-RAH-kah)</w:t>
             </w:r>
           </w:p>
         </w:tc>
@@ -573,7 +700,7 @@
                 <w:rFonts w:ascii="Arial" w:hAnsi="Arial"/>
                 <w:sz w:val="17"/>
               </w:rPr>
-              <w:t>Ceremonial/drink plant preparation used across parts of Polynesia; in the manuscript it appears as a drink shared in ritual/social settings.</w:t>
+              <w:t>A coastal tree with glossy leaves and orange fruit.</w:t>
             </w:r>
           </w:p>
         </w:tc>
@@ -593,7 +720,10 @@
                 <w:rFonts w:ascii="Arial" w:hAnsi="Arial"/>
                 <w:sz w:val="17"/>
               </w:rPr>
-              <w:t>kete</w:t>
+              <w:t>kauri</w:t>
+            </w:r>
+            <w:r>
+              <w:t xml:space="preserve"> (KOW-ree)</w:t>
             </w:r>
           </w:p>
         </w:tc>
@@ -611,7 +741,7 @@
                 <w:rFonts w:ascii="Arial" w:hAnsi="Arial"/>
                 <w:sz w:val="17"/>
               </w:rPr>
-              <w:t>Woven basket, pouch, or kit.</w:t>
+              <w:t>Large native forest tree. In the manuscript it can also appear in elevated or personified chant contexts.</w:t>
             </w:r>
           </w:p>
         </w:tc>
@@ -631,7 +761,10 @@
                 <w:rFonts w:ascii="Arial" w:hAnsi="Arial"/>
                 <w:sz w:val="17"/>
               </w:rPr>
-              <w:t>kōhū</w:t>
+              <w:t>kava</w:t>
+            </w:r>
+            <w:r>
+              <w:t xml:space="preserve"> (KAH-vah)</w:t>
             </w:r>
           </w:p>
         </w:tc>
@@ -649,7 +782,7 @@
                 <w:rFonts w:ascii="Arial" w:hAnsi="Arial"/>
                 <w:sz w:val="17"/>
               </w:rPr>
-              <w:t>In-world medicinal salve or herb used against fever.</w:t>
+              <w:t>Ceremonial/drink plant preparation used across parts of Polynesia; in the manuscript it appears as a drink shared in ritual/social settings.</w:t>
             </w:r>
           </w:p>
         </w:tc>
@@ -669,7 +802,10 @@
                 <w:rFonts w:ascii="Arial" w:hAnsi="Arial"/>
                 <w:sz w:val="17"/>
               </w:rPr>
-              <w:t>kūmara</w:t>
+              <w:t>kete</w:t>
+            </w:r>
+            <w:r>
+              <w:t xml:space="preserve"> (KEH-teh)</w:t>
             </w:r>
           </w:p>
         </w:tc>
@@ -687,7 +823,7 @@
                 <w:rFonts w:ascii="Arial" w:hAnsi="Arial"/>
                 <w:sz w:val="17"/>
               </w:rPr>
-              <w:t>Sweet potato.</w:t>
+              <w:t>Woven basket, pouch, or kit.</w:t>
             </w:r>
           </w:p>
         </w:tc>
@@ -707,7 +843,10 @@
                 <w:rFonts w:ascii="Arial" w:hAnsi="Arial"/>
                 <w:sz w:val="17"/>
               </w:rPr>
-              <w:t>lavālava</w:t>
+              <w:t>kōhū</w:t>
+            </w:r>
+            <w:r>
+              <w:t xml:space="preserve"> (KOH-hoo)</w:t>
             </w:r>
           </w:p>
         </w:tc>
@@ -725,7 +864,7 @@
                 <w:rFonts w:ascii="Arial" w:hAnsi="Arial"/>
                 <w:sz w:val="17"/>
               </w:rPr>
-              <w:t>Wrapped cloth garment.</w:t>
+              <w:t>In-world medicinal salve or herb used against fever.</w:t>
             </w:r>
           </w:p>
         </w:tc>
@@ -745,7 +884,10 @@
                 <w:rFonts w:ascii="Arial" w:hAnsi="Arial"/>
                 <w:sz w:val="17"/>
               </w:rPr>
-              <w:t>mākutu</w:t>
+              <w:t>kūmara</w:t>
+            </w:r>
+            <w:r>
+              <w:t xml:space="preserve"> (KOO-mah-rah)</w:t>
             </w:r>
           </w:p>
         </w:tc>
@@ -763,7 +905,7 @@
                 <w:rFonts w:ascii="Arial" w:hAnsi="Arial"/>
                 <w:sz w:val="17"/>
               </w:rPr>
-              <w:t>Magic, curse, or ritual harm. Appears in the phrase `tohunga mākutu`.</w:t>
+              <w:t>Sweet potato.</w:t>
             </w:r>
           </w:p>
         </w:tc>
@@ -783,7 +925,10 @@
                 <w:rFonts w:ascii="Arial" w:hAnsi="Arial"/>
                 <w:sz w:val="17"/>
               </w:rPr>
-              <w:t>mana</w:t>
+              <w:t>lavālava</w:t>
+            </w:r>
+            <w:r>
+              <w:t xml:space="preserve"> (lah-VAH-lah-vah)</w:t>
             </w:r>
           </w:p>
         </w:tc>
@@ -801,7 +946,7 @@
                 <w:rFonts w:ascii="Arial" w:hAnsi="Arial"/>
                 <w:sz w:val="17"/>
               </w:rPr>
-              <w:t>Prestige, authority, status, spiritual force, and power. In the story it can be social rank, divine potency, personal strength, or something expended in action.</w:t>
+              <w:t>Wrapped cloth garment.</w:t>
             </w:r>
           </w:p>
         </w:tc>
@@ -817,11 +962,7 @@
               <w:spacing w:after="0"/>
             </w:pPr>
             <w:r>
-              <w:rPr>
-                <w:rFonts w:ascii="Arial" w:hAnsi="Arial"/>
-                <w:sz w:val="17"/>
-              </w:rPr>
-              <w:t>maro</w:t>
+              <w:t xml:space="preserve">mahoe (mah-HOH-eh)</w:t>
             </w:r>
           </w:p>
         </w:tc>
@@ -835,11 +976,7 @@
               <w:spacing w:after="0"/>
             </w:pPr>
             <w:r>
-              <w:rPr>
-                <w:rFonts w:ascii="Arial" w:hAnsi="Arial"/>
-                <w:sz w:val="17"/>
-              </w:rPr>
-              <w:t>Loincloth or waist garment; appears in clothing descriptions.</w:t>
+              <w:t xml:space="preserve">A fast-growing native tree whose soft wood traditionally serves as the base board in hika fire-making.</w:t>
             </w:r>
           </w:p>
         </w:tc>
@@ -859,7 +996,10 @@
                 <w:rFonts w:ascii="Arial" w:hAnsi="Arial"/>
                 <w:sz w:val="17"/>
               </w:rPr>
-              <w:t>moa</w:t>
+              <w:t>mākutu</w:t>
+            </w:r>
+            <w:r>
+              <w:t xml:space="preserve"> (MAH-koo-too)</w:t>
             </w:r>
           </w:p>
         </w:tc>
@@ -877,7 +1017,7 @@
                 <w:rFonts w:ascii="Arial" w:hAnsi="Arial"/>
                 <w:sz w:val="17"/>
               </w:rPr>
-              <w:t>Large flightless bird; in the manuscript also a significant food/ride/gift animal.</w:t>
+              <w:t>Magic, curse, or ritual harm. Appears in the phrase `tohunga mākutu`.</w:t>
             </w:r>
           </w:p>
         </w:tc>
@@ -897,7 +1037,10 @@
                 <w:rFonts w:ascii="Arial" w:hAnsi="Arial"/>
                 <w:sz w:val="17"/>
               </w:rPr>
-              <w:t>motu</w:t>
+              <w:t>mana</w:t>
+            </w:r>
+            <w:r>
+              <w:t xml:space="preserve"> (MAH-nah)</w:t>
             </w:r>
           </w:p>
         </w:tc>
@@ -915,7 +1058,7 @@
                 <w:rFonts w:ascii="Arial" w:hAnsi="Arial"/>
                 <w:sz w:val="17"/>
               </w:rPr>
-              <w:t>Island. Appears in `Kafiki Motu`.</w:t>
+              <w:t>Prestige, authority, status, spiritual force, and power. In the story it can be social rank, divine potency, personal strength, or something expended in action.</w:t>
             </w:r>
           </w:p>
         </w:tc>
@@ -935,7 +1078,10 @@
                 <w:rFonts w:ascii="Arial" w:hAnsi="Arial"/>
                 <w:sz w:val="17"/>
               </w:rPr>
-              <w:t>muka</w:t>
+              <w:t>maro</w:t>
+            </w:r>
+            <w:r>
+              <w:t xml:space="preserve"> (MAH-roh)</w:t>
             </w:r>
           </w:p>
         </w:tc>
@@ -953,7 +1099,7 @@
                 <w:rFonts w:ascii="Arial" w:hAnsi="Arial"/>
                 <w:sz w:val="17"/>
               </w:rPr>
-              <w:t>Prepared flax fibre, used for weaving.</w:t>
+              <w:t>Loincloth or waist garment; appears in clothing descriptions.</w:t>
             </w:r>
           </w:p>
         </w:tc>
@@ -969,11 +1115,7 @@
               <w:spacing w:after="0"/>
             </w:pPr>
             <w:r>
-              <w:rPr>
-                <w:rFonts w:ascii="Arial" w:hAnsi="Arial"/>
-                <w:sz w:val="17"/>
-              </w:rPr>
-              <w:t>namu</w:t>
+              <w:t xml:space="preserve">miro (MEE-roh)</w:t>
             </w:r>
           </w:p>
         </w:tc>
@@ -987,11 +1129,7 @@
               <w:spacing w:after="0"/>
             </w:pPr>
             <w:r>
-              <w:rPr>
-                <w:rFonts w:ascii="Arial" w:hAnsi="Arial"/>
-                <w:sz w:val="17"/>
-              </w:rPr>
-              <w:t>Sandfly/gnat-based insult or in-world slang.</w:t>
+              <w:t xml:space="preserve">A native forest tree bearing bright red berries; appears in jungle and forest-path descriptions in the manuscript.</w:t>
             </w:r>
           </w:p>
         </w:tc>
@@ -1011,7 +1149,10 @@
                 <w:rFonts w:ascii="Arial" w:hAnsi="Arial"/>
                 <w:sz w:val="17"/>
               </w:rPr>
-              <w:t>ngeri</w:t>
+              <w:t>moa</w:t>
+            </w:r>
+            <w:r>
+              <w:t xml:space="preserve"> (MOH-ah)</w:t>
             </w:r>
           </w:p>
         </w:tc>
@@ -1029,7 +1170,7 @@
                 <w:rFonts w:ascii="Arial" w:hAnsi="Arial"/>
                 <w:sz w:val="17"/>
               </w:rPr>
-              <w:t>Short chant or haka-like performance. In the manuscript, used for rhythmic chant and battle/ritual expression.</w:t>
+              <w:t>Large flightless bird; in the manuscript also a significant food/ride/gift animal.</w:t>
             </w:r>
           </w:p>
         </w:tc>
@@ -1045,11 +1186,7 @@
               <w:spacing w:after="0"/>
             </w:pPr>
             <w:r>
-              <w:rPr>
-                <w:rFonts w:ascii="Arial" w:hAnsi="Arial"/>
-                <w:sz w:val="17"/>
-              </w:rPr>
-              <w:t>pā</w:t>
+              <w:t xml:space="preserve">moai (MOH-ai)</w:t>
             </w:r>
           </w:p>
         </w:tc>
@@ -1063,11 +1200,7 @@
               <w:spacing w:after="0"/>
             </w:pPr>
             <w:r>
-              <w:rPr>
-                <w:rFonts w:ascii="Arial" w:hAnsi="Arial"/>
-                <w:sz w:val="17"/>
-              </w:rPr>
-              <w:t>Fortified settlement or village enclosure; in manuscript context, may also be used more generally for settlement/place.</w:t>
+              <w:t xml:space="preserve">The monumental stone statues of Rapa Nui (Easter Island); used in the manuscript as a simile for crushing, immovable weight.</w:t>
             </w:r>
           </w:p>
         </w:tc>
@@ -1083,11 +1216,7 @@
               <w:spacing w:after="0"/>
             </w:pPr>
             <w:r>
-              <w:rPr>
-                <w:rFonts w:ascii="Arial" w:hAnsi="Arial"/>
-                <w:sz w:val="17"/>
-              </w:rPr>
-              <w:t>pākē</w:t>
+              <w:t xml:space="preserve">moi (MOH-ee)</w:t>
             </w:r>
           </w:p>
         </w:tc>
@@ -1101,11 +1230,7 @@
               <w:spacing w:after="0"/>
             </w:pPr>
             <w:r>
-              <w:rPr>
-                <w:rFonts w:ascii="Arial" w:hAnsi="Arial"/>
-                <w:sz w:val="17"/>
-              </w:rPr>
-              <w:t>Rough cape or rain cape made from undressed leaves or flax.</w:t>
+              <w:t xml:space="preserve">Threadfin fish; a valued Pacific food fish. The first named creature in the novel, dying on the end of Ho’s spear in the opening scene.</w:t>
             </w:r>
           </w:p>
         </w:tc>
@@ -1125,7 +1250,10 @@
                 <w:rFonts w:ascii="Arial" w:hAnsi="Arial"/>
                 <w:sz w:val="17"/>
               </w:rPr>
-              <w:t>paoa</w:t>
+              <w:t>motu</w:t>
+            </w:r>
+            <w:r>
+              <w:t xml:space="preserve"> (MOH-too)</w:t>
             </w:r>
           </w:p>
         </w:tc>
@@ -1143,7 +1271,7 @@
                 <w:rFonts w:ascii="Arial" w:hAnsi="Arial"/>
                 <w:sz w:val="17"/>
               </w:rPr>
-              <w:t>In-world medicinal salve or herb used against fever.</w:t>
+              <w:t>Island. Appears in `Kafiki Motu`.</w:t>
             </w:r>
           </w:p>
         </w:tc>
@@ -1163,7 +1291,10 @@
                 <w:rFonts w:ascii="Arial" w:hAnsi="Arial"/>
                 <w:sz w:val="17"/>
               </w:rPr>
-              <w:t>patupaiarehe</w:t>
+              <w:t>muka</w:t>
+            </w:r>
+            <w:r>
+              <w:t xml:space="preserve"> (MOO-kah)</w:t>
             </w:r>
           </w:p>
         </w:tc>
@@ -1181,7 +1312,7 @@
                 <w:rFonts w:ascii="Arial" w:hAnsi="Arial"/>
                 <w:sz w:val="17"/>
               </w:rPr>
-              <w:t>Fairy folk; fair-skinned supernatural people associated with bush, mountains, mist, and avoidance of fire.</w:t>
+              <w:t>Prepared flax fibre, used for weaving.</w:t>
             </w:r>
           </w:p>
         </w:tc>
@@ -1201,7 +1332,10 @@
                 <w:rFonts w:ascii="Arial" w:hAnsi="Arial"/>
                 <w:sz w:val="17"/>
               </w:rPr>
-              <w:t>pāua</w:t>
+              <w:t>namu</w:t>
+            </w:r>
+            <w:r>
+              <w:t xml:space="preserve"> (NAH-moo)</w:t>
             </w:r>
           </w:p>
         </w:tc>
@@ -1219,7 +1353,7 @@
                 <w:rFonts w:ascii="Arial" w:hAnsi="Arial"/>
                 <w:sz w:val="17"/>
               </w:rPr>
-              <w:t>Abalone/paua shell, often valued for its iridescence.</w:t>
+              <w:t>Sandfly/gnat-based insult or in-world slang.</w:t>
             </w:r>
           </w:p>
         </w:tc>
@@ -1239,7 +1373,10 @@
                 <w:rFonts w:ascii="Arial" w:hAnsi="Arial"/>
                 <w:sz w:val="17"/>
               </w:rPr>
-              <w:t>poerava</w:t>
+              <w:t>ngeri</w:t>
+            </w:r>
+            <w:r>
+              <w:t xml:space="preserve"> (NGEH-ree)</w:t>
             </w:r>
           </w:p>
         </w:tc>
@@ -1257,7 +1394,7 @@
                 <w:rFonts w:ascii="Arial" w:hAnsi="Arial"/>
                 <w:sz w:val="17"/>
               </w:rPr>
-              <w:t>Tahitian black pearl; in the manuscript, black pearl ornaments worn ceremonially, later used figuratively for a small dark glint of hope beneath the surface.</w:t>
+              <w:t>Short chant or haka-like performance. In the manuscript, used for rhythmic chant and battle/ritual expression.</w:t>
             </w:r>
           </w:p>
         </w:tc>
@@ -1273,11 +1410,7 @@
               <w:spacing w:after="0"/>
             </w:pPr>
             <w:r>
-              <w:rPr>
-                <w:rFonts w:ascii="Arial" w:hAnsi="Arial"/>
-                <w:sz w:val="17"/>
-              </w:rPr>
-              <w:t>pōhutukawa</w:t>
+              <w:t xml:space="preserve">ōtaha (OH-tah-hah)</w:t>
             </w:r>
           </w:p>
         </w:tc>
@@ -1291,11 +1424,7 @@
               <w:spacing w:after="0"/>
             </w:pPr>
             <w:r>
-              <w:rPr>
-                <w:rFonts w:ascii="Arial" w:hAnsi="Arial"/>
-                <w:sz w:val="17"/>
-              </w:rPr>
-              <w:t>Coastal tree with red flowers.</w:t>
+              <w:t xml:space="preserve">Frigate bird; a large seabird that soars effortlessly on thermals. In the manuscript one is struck from the air by a falling stone egg during the sky-tear event.</w:t>
             </w:r>
           </w:p>
         </w:tc>
@@ -1315,7 +1444,10 @@
                 <w:rFonts w:ascii="Arial" w:hAnsi="Arial"/>
                 <w:sz w:val="17"/>
               </w:rPr>
-              <w:t>Pouākai</w:t>
+              <w:t>pā</w:t>
+            </w:r>
+            <w:r>
+              <w:t xml:space="preserve"> (PAH)</w:t>
             </w:r>
           </w:p>
         </w:tc>
@@ -1333,7 +1465,7 @@
                 <w:rFonts w:ascii="Arial" w:hAnsi="Arial"/>
                 <w:sz w:val="17"/>
               </w:rPr>
-              <w:t>Giant mythic/extinct bird of prey; in manuscript context, associated with Autara eagle hunters or tracker-hunters.</w:t>
+              <w:t>Fortified settlement or village enclosure; in manuscript context, may also be used more generally for settlement/place.</w:t>
             </w:r>
           </w:p>
         </w:tc>
@@ -1353,7 +1485,10 @@
                 <w:rFonts w:ascii="Arial" w:hAnsi="Arial"/>
                 <w:sz w:val="17"/>
               </w:rPr>
-              <w:t>pounamu</w:t>
+              <w:t>pākē</w:t>
+            </w:r>
+            <w:r>
+              <w:t xml:space="preserve"> (PAH-keh)</w:t>
             </w:r>
           </w:p>
         </w:tc>
@@ -1371,7 +1506,7 @@
                 <w:rFonts w:ascii="Arial" w:hAnsi="Arial"/>
                 <w:sz w:val="17"/>
               </w:rPr>
-              <w:t>Greenstone/nephrite/jade; also used as Selai's private pet name. Carries connotations of beauty, value, and preciousness.</w:t>
+              <w:t>Rough cape or rain cape made from undressed leaves or flax.</w:t>
             </w:r>
           </w:p>
         </w:tc>
@@ -1391,7 +1526,10 @@
                 <w:rFonts w:ascii="Arial" w:hAnsi="Arial"/>
                 <w:sz w:val="17"/>
               </w:rPr>
-              <w:t>puaka</w:t>
+              <w:t>paoa</w:t>
+            </w:r>
+            <w:r>
+              <w:t xml:space="preserve"> (pah-OH-ah)</w:t>
             </w:r>
           </w:p>
         </w:tc>
@@ -1409,7 +1547,7 @@
                 <w:rFonts w:ascii="Arial" w:hAnsi="Arial"/>
                 <w:sz w:val="17"/>
               </w:rPr>
-              <w:t>Pig.</w:t>
+              <w:t>In-world medicinal salve or herb used against fever.</w:t>
             </w:r>
           </w:p>
         </w:tc>
@@ -1425,11 +1563,7 @@
               <w:spacing w:after="0"/>
             </w:pPr>
             <w:r>
-              <w:rPr>
-                <w:rFonts w:ascii="Arial" w:hAnsi="Arial"/>
-                <w:sz w:val="17"/>
-              </w:rPr>
-              <w:t>puga</w:t>
+              <w:t xml:space="preserve">paru (PAH-roo)</w:t>
             </w:r>
           </w:p>
         </w:tc>
@@ -1443,11 +1577,7 @@
               <w:spacing w:after="0"/>
             </w:pPr>
             <w:r>
-              <w:rPr>
-                <w:rFonts w:ascii="Arial" w:hAnsi="Arial"/>
-                <w:sz w:val="17"/>
-              </w:rPr>
-              <w:t>In-world substance, drink, powder, or crushed coral preparation with intoxicating/ritual effects.</w:t>
+              <w:t xml:space="preserve">Mud, mire; ruined or not working. Used in the manuscript as colloquial slang for something broken or out of use: “Patu gone paru.”</w:t>
             </w:r>
           </w:p>
         </w:tc>
@@ -1463,11 +1593,7 @@
               <w:spacing w:after="0"/>
             </w:pPr>
             <w:r>
-              <w:rPr>
-                <w:rFonts w:ascii="Arial" w:hAnsi="Arial"/>
-                <w:sz w:val="17"/>
-              </w:rPr>
-              <w:t>rāhui / rahui</w:t>
+              <w:t xml:space="preserve">patu (PAH-too)</w:t>
             </w:r>
           </w:p>
         </w:tc>
@@ -1481,11 +1607,7 @@
               <w:spacing w:after="0"/>
             </w:pPr>
             <w:r>
-              <w:rPr>
-                <w:rFonts w:ascii="Arial" w:hAnsi="Arial"/>
-                <w:sz w:val="17"/>
-              </w:rPr>
-              <w:t>Temporary restriction, prohibition, or sacred ban placed over an area or resource. Manuscript has both macron and non-macron forms.</w:t>
+              <w:t xml:space="preserve">Short-handled striking weapon; a Māori hand-club used in close combat. Also used in colloquial and literary contexts as a euphemism for the penis.</w:t>
             </w:r>
           </w:p>
         </w:tc>
@@ -1505,7 +1627,10 @@
                 <w:rFonts w:ascii="Arial" w:hAnsi="Arial"/>
                 <w:sz w:val="17"/>
               </w:rPr>
-              <w:t>rauhā-tangi</w:t>
+              <w:t>patupaiarehe</w:t>
+            </w:r>
+            <w:r>
+              <w:t xml:space="preserve"> (pah-too-pai-ah-REH-heh)</w:t>
             </w:r>
           </w:p>
         </w:tc>
@@ -1523,7 +1648,7 @@
                 <w:rFonts w:ascii="Arial" w:hAnsi="Arial"/>
                 <w:sz w:val="17"/>
               </w:rPr>
-              <w:t>In-world herb used to sharpen inner sight and widen perception.</w:t>
+              <w:t>Fairy folk; fair-skinned supernatural people associated with bush, mountains, mist, and avoidance of fire.</w:t>
             </w:r>
           </w:p>
         </w:tc>
@@ -1543,7 +1668,10 @@
                 <w:rFonts w:ascii="Arial" w:hAnsi="Arial"/>
                 <w:sz w:val="17"/>
               </w:rPr>
-              <w:t>rohe</w:t>
+              <w:t>pāua</w:t>
+            </w:r>
+            <w:r>
+              <w:t xml:space="preserve"> (PAH-oo-ah)</w:t>
             </w:r>
           </w:p>
         </w:tc>
@@ -1561,7 +1689,7 @@
                 <w:rFonts w:ascii="Arial" w:hAnsi="Arial"/>
                 <w:sz w:val="17"/>
               </w:rPr>
-              <w:t>Boundary, territory, region, or district. Often used for tribal land/area of authority.</w:t>
+              <w:t>Abalone/paua shell, often valued for its iridescence.</w:t>
             </w:r>
           </w:p>
         </w:tc>
@@ -1581,7 +1709,10 @@
                 <w:rFonts w:ascii="Arial" w:hAnsi="Arial"/>
                 <w:sz w:val="17"/>
               </w:rPr>
-              <w:t>tāhei</w:t>
+              <w:t>poerava</w:t>
+            </w:r>
+            <w:r>
+              <w:t xml:space="preserve"> (poh-EH-rah-vah)</w:t>
             </w:r>
           </w:p>
         </w:tc>
@@ -1599,7 +1730,7 @@
                 <w:rFonts w:ascii="Arial" w:hAnsi="Arial"/>
                 <w:sz w:val="17"/>
               </w:rPr>
-              <w:t>Necklace or ornament worn at the chest/neck.</w:t>
+              <w:t>Tahitian black pearl; in the manuscript, black pearl ornaments worn ceremonially, later used figuratively for a small dark glint of hope beneath the surface.</w:t>
             </w:r>
           </w:p>
         </w:tc>
@@ -1619,7 +1750,10 @@
                 <w:rFonts w:ascii="Arial" w:hAnsi="Arial"/>
                 <w:sz w:val="17"/>
               </w:rPr>
-              <w:t>tāmure</w:t>
+              <w:t>pōhutukawa</w:t>
+            </w:r>
+            <w:r>
+              <w:t xml:space="preserve"> (POH-hoo-too-KAH-wah)</w:t>
             </w:r>
           </w:p>
         </w:tc>
@@ -1637,7 +1771,7 @@
                 <w:rFonts w:ascii="Arial" w:hAnsi="Arial"/>
                 <w:sz w:val="17"/>
               </w:rPr>
-              <w:t>Snapper/fish.</w:t>
+              <w:t>Coastal tree with red flowers.</w:t>
             </w:r>
           </w:p>
         </w:tc>
@@ -1657,7 +1791,10 @@
                 <w:rFonts w:ascii="Arial" w:hAnsi="Arial"/>
                 <w:sz w:val="17"/>
               </w:rPr>
-              <w:t>tāniko</w:t>
+              <w:t>Pouākai</w:t>
+            </w:r>
+            <w:r>
+              <w:t xml:space="preserve"> (poh-AH-kai)</w:t>
             </w:r>
           </w:p>
         </w:tc>
@@ -1675,7 +1812,7 @@
                 <w:rFonts w:ascii="Arial" w:hAnsi="Arial"/>
                 <w:sz w:val="17"/>
               </w:rPr>
-              <w:t>Decorative woven border or patterned weaving.</w:t>
+              <w:t>Giant mythic/extinct bird of prey; in manuscript context, associated with Autara eagle hunters or tracker-hunters.</w:t>
             </w:r>
           </w:p>
         </w:tc>
@@ -1695,7 +1832,10 @@
                 <w:rFonts w:ascii="Arial" w:hAnsi="Arial"/>
                 <w:sz w:val="17"/>
               </w:rPr>
-              <w:t>taonga</w:t>
+              <w:t>pounamu</w:t>
+            </w:r>
+            <w:r>
+              <w:t xml:space="preserve"> (poh-NAH-moo)</w:t>
             </w:r>
           </w:p>
         </w:tc>
@@ -1713,7 +1853,7 @@
                 <w:rFonts w:ascii="Arial" w:hAnsi="Arial"/>
                 <w:sz w:val="17"/>
               </w:rPr>
-              <w:t>Treasure, prized object, valued resource, or anything held precious.</w:t>
+              <w:t>Greenstone/nephrite/jade; also used as Selai's private pet name. Carries connotations of beauty, value, and preciousness.</w:t>
             </w:r>
           </w:p>
         </w:tc>
@@ -1733,7 +1873,10 @@
                 <w:rFonts w:ascii="Arial" w:hAnsi="Arial"/>
                 <w:sz w:val="17"/>
               </w:rPr>
-              <w:t>tapa</w:t>
+              <w:t>puaka</w:t>
+            </w:r>
+            <w:r>
+              <w:t xml:space="preserve"> (poo-AH-kah)</w:t>
             </w:r>
           </w:p>
         </w:tc>
@@ -1751,7 +1894,7 @@
                 <w:rFonts w:ascii="Arial" w:hAnsi="Arial"/>
                 <w:sz w:val="17"/>
               </w:rPr>
-              <w:t>Barkcloth; in the manuscript, appears as mat, cord, and cloth material.</w:t>
+              <w:t>Pig.</w:t>
             </w:r>
           </w:p>
         </w:tc>
@@ -1771,7 +1914,10 @@
                 <w:rFonts w:ascii="Arial" w:hAnsi="Arial"/>
                 <w:sz w:val="17"/>
               </w:rPr>
-              <w:t>tapu</w:t>
+              <w:t>puga</w:t>
+            </w:r>
+            <w:r>
+              <w:t xml:space="preserve"> (POO-gah)</w:t>
             </w:r>
           </w:p>
         </w:tc>
@@ -1789,7 +1935,7 @@
                 <w:rFonts w:ascii="Arial" w:hAnsi="Arial"/>
                 <w:sz w:val="17"/>
               </w:rPr>
-              <w:t>Sacred, restricted, forbidden, taboo, or set apart.</w:t>
+              <w:t>In-world substance, drink, powder, or crushed coral preparation with intoxicating/ritual effects.</w:t>
             </w:r>
           </w:p>
         </w:tc>
@@ -1809,7 +1955,10 @@
                 <w:rFonts w:ascii="Arial" w:hAnsi="Arial"/>
                 <w:sz w:val="17"/>
               </w:rPr>
-              <w:t>taro</w:t>
+              <w:t>rāhui / rahui</w:t>
+            </w:r>
+            <w:r>
+              <w:t xml:space="preserve"> (RAH-hwee)</w:t>
             </w:r>
           </w:p>
         </w:tc>
@@ -1827,7 +1976,7 @@
                 <w:rFonts w:ascii="Arial" w:hAnsi="Arial"/>
                 <w:sz w:val="17"/>
               </w:rPr>
-              <w:t>Root crop/staple food.</w:t>
+              <w:t>Temporary restriction, prohibition, or sacred ban placed over an area or resource. Manuscript has both macron and non-macron forms.</w:t>
             </w:r>
           </w:p>
         </w:tc>
@@ -1843,11 +1992,7 @@
               <w:spacing w:after="0"/>
             </w:pPr>
             <w:r>
-              <w:rPr>
-                <w:rFonts w:ascii="Arial" w:hAnsi="Arial"/>
-                <w:sz w:val="17"/>
-              </w:rPr>
-              <w:t>tī</w:t>
+              <w:t xml:space="preserve">rangatahi (rang-ah-TAH-hee)</w:t>
             </w:r>
           </w:p>
         </w:tc>
@@ -1861,11 +2006,7 @@
               <w:spacing w:after="0"/>
             </w:pPr>
             <w:r>
-              <w:rPr>
-                <w:rFonts w:ascii="Arial" w:hAnsi="Arial"/>
-                <w:sz w:val="17"/>
-              </w:rPr>
-              <w:t>Cabbage tree; leaves may be used for skirts, coverings, or other material culture.</w:t>
+              <w:t xml:space="preserve">Young people; youth. Used as a descriptor in the manuscript: atua rangatahi, young divine offspring of mixed descent.</w:t>
             </w:r>
           </w:p>
         </w:tc>
@@ -1885,7 +2026,10 @@
                 <w:rFonts w:ascii="Arial" w:hAnsi="Arial"/>
                 <w:sz w:val="17"/>
               </w:rPr>
-              <w:t>tika</w:t>
+              <w:t>rauhā-tangi</w:t>
+            </w:r>
+            <w:r>
+              <w:t xml:space="preserve"> (row-HAH-tahng-ee)</w:t>
             </w:r>
           </w:p>
         </w:tc>
@@ -1903,7 +2047,7 @@
                 <w:rFonts w:ascii="Arial" w:hAnsi="Arial"/>
                 <w:sz w:val="17"/>
               </w:rPr>
-              <w:t>Correct, right, proper, just, or fitting.</w:t>
+              <w:t>In-world herb used to sharpen inner sight and widen perception.</w:t>
             </w:r>
           </w:p>
         </w:tc>
@@ -1923,7 +2067,10 @@
                 <w:rFonts w:ascii="Arial" w:hAnsi="Arial"/>
                 <w:sz w:val="17"/>
               </w:rPr>
-              <w:t>toetoe</w:t>
+              <w:t>rohe</w:t>
+            </w:r>
+            <w:r>
+              <w:t xml:space="preserve"> (ROH-heh)</w:t>
             </w:r>
           </w:p>
         </w:tc>
@@ -1941,7 +2088,7 @@
                 <w:rFonts w:ascii="Arial" w:hAnsi="Arial"/>
                 <w:sz w:val="17"/>
               </w:rPr>
-              <w:t>Reed/grass-like plant or thatch material; in context, sharp blades cut the hand.</w:t>
+              <w:t>Boundary, territory, region, or district. Often used for tribal land/area of authority.</w:t>
             </w:r>
           </w:p>
         </w:tc>
@@ -1961,7 +2108,10 @@
                 <w:rFonts w:ascii="Arial" w:hAnsi="Arial"/>
                 <w:sz w:val="17"/>
               </w:rPr>
-              <w:t>tohunga</w:t>
+              <w:t>tāhei</w:t>
+            </w:r>
+            <w:r>
+              <w:t xml:space="preserve"> (TAH-heh-ee)</w:t>
             </w:r>
           </w:p>
         </w:tc>
@@ -1979,7 +2129,7 @@
                 <w:rFonts w:ascii="Arial" w:hAnsi="Arial"/>
                 <w:sz w:val="17"/>
               </w:rPr>
-              <w:t>Expert, priest, healer, ritual specialist, or keeper of sacred knowledge.</w:t>
+              <w:t>Necklace or ornament worn at the chest/neck.</w:t>
             </w:r>
           </w:p>
         </w:tc>
@@ -1999,7 +2149,10 @@
                 <w:rFonts w:ascii="Arial" w:hAnsi="Arial"/>
                 <w:sz w:val="17"/>
               </w:rPr>
-              <w:t>tōtara</w:t>
+              <w:t>tāmure</w:t>
+            </w:r>
+            <w:r>
+              <w:t xml:space="preserve"> (TAH-moo-reh)</w:t>
             </w:r>
           </w:p>
         </w:tc>
@@ -2017,7 +2170,7 @@
                 <w:rFonts w:ascii="Arial" w:hAnsi="Arial"/>
                 <w:sz w:val="17"/>
               </w:rPr>
-              <w:t>Native tree; appears in forest/clearing scenes.</w:t>
+              <w:t>Snapper/fish.</w:t>
             </w:r>
           </w:p>
         </w:tc>
@@ -2037,7 +2190,10 @@
                 <w:rFonts w:ascii="Arial" w:hAnsi="Arial"/>
                 <w:sz w:val="17"/>
               </w:rPr>
-              <w:t>tūrama</w:t>
+              <w:t>tāniko</w:t>
+            </w:r>
+            <w:r>
+              <w:t xml:space="preserve"> (TAH-nee-koh)</w:t>
             </w:r>
           </w:p>
         </w:tc>
@@ -2055,7 +2211,7 @@
                 <w:rFonts w:ascii="Arial" w:hAnsi="Arial"/>
                 <w:sz w:val="17"/>
               </w:rPr>
-              <w:t>In-world yellow dye or plant-dye source used for bright garments.</w:t>
+              <w:t>Decorative woven border or patterned weaving.</w:t>
             </w:r>
           </w:p>
         </w:tc>
@@ -2071,11 +2227,7 @@
               <w:spacing w:after="0"/>
             </w:pPr>
             <w:r>
-              <w:rPr>
-                <w:rFonts w:ascii="Arial" w:hAnsi="Arial"/>
-                <w:sz w:val="17"/>
-              </w:rPr>
-              <w:t>utu</w:t>
+              <w:t xml:space="preserve">taniwha (tah-NEE-fah)</w:t>
             </w:r>
           </w:p>
         </w:tc>
@@ -2089,11 +2241,7 @@
               <w:spacing w:after="0"/>
             </w:pPr>
             <w:r>
-              <w:rPr>
-                <w:rFonts w:ascii="Arial" w:hAnsi="Arial"/>
-                <w:sz w:val="17"/>
-              </w:rPr>
-              <w:t>Reciprocity, payment, compensation, revenge, or balancing response. In the story it often carries the weight of blood debt and moral balancing.</w:t>
+              <w:t xml:space="preserve">Supernatural creature associated with deep water; powerful and often dangerous beings that inhabit rivers, lakes, and the sea.</w:t>
             </w:r>
           </w:p>
         </w:tc>
@@ -2113,7 +2261,10 @@
                 <w:rFonts w:ascii="Arial" w:hAnsi="Arial"/>
                 <w:sz w:val="17"/>
               </w:rPr>
-              <w:t>wairua</w:t>
+              <w:t>taonga</w:t>
+            </w:r>
+            <w:r>
+              <w:t xml:space="preserve"> (tah-ONG-ah)</w:t>
             </w:r>
           </w:p>
         </w:tc>
@@ -2131,7 +2282,7 @@
                 <w:rFonts w:ascii="Arial" w:hAnsi="Arial"/>
                 <w:sz w:val="17"/>
               </w:rPr>
-              <w:t>Spirit or soul. In the manuscript, often used when body, memory, and spiritual self separate or return.</w:t>
+              <w:t>Treasure, prized object, valued resource, or anything held precious.</w:t>
             </w:r>
           </w:p>
         </w:tc>
@@ -2151,7 +2302,10 @@
                 <w:rFonts w:ascii="Arial" w:hAnsi="Arial"/>
                 <w:sz w:val="17"/>
               </w:rPr>
-              <w:t>waka</w:t>
+              <w:t>tapa</w:t>
+            </w:r>
+            <w:r>
+              <w:t xml:space="preserve"> (TAH-pah)</w:t>
             </w:r>
           </w:p>
         </w:tc>
@@ -2169,7 +2323,7 @@
                 <w:rFonts w:ascii="Arial" w:hAnsi="Arial"/>
                 <w:sz w:val="17"/>
               </w:rPr>
-              <w:t>Canoe or vessel. Central to travel, exile, return, and ocean navigation.</w:t>
+              <w:t>Barkcloth; in the manuscript, appears as mat, cord, and cloth material.</w:t>
             </w:r>
           </w:p>
         </w:tc>
@@ -2189,7 +2343,10 @@
                 <w:rFonts w:ascii="Arial" w:hAnsi="Arial"/>
                 <w:sz w:val="17"/>
               </w:rPr>
-              <w:t>whakataukī</w:t>
+              <w:t>tapu</w:t>
+            </w:r>
+            <w:r>
+              <w:t xml:space="preserve"> (TAH-poo)</w:t>
             </w:r>
           </w:p>
         </w:tc>
@@ -2207,7 +2364,7 @@
                 <w:rFonts w:ascii="Arial" w:hAnsi="Arial"/>
                 <w:sz w:val="17"/>
               </w:rPr>
-              <w:t>Proverb or proverbial saying.</w:t>
+              <w:t>Sacred, restricted, forbidden, taboo, or set apart.</w:t>
             </w:r>
           </w:p>
         </w:tc>
@@ -2227,7 +2384,521 @@
                 <w:rFonts w:ascii="Arial" w:hAnsi="Arial"/>
                 <w:sz w:val="17"/>
               </w:rPr>
+              <w:t>taro</w:t>
+            </w:r>
+            <w:r>
+              <w:t xml:space="preserve"> (TAH-roh)</w:t>
+            </w:r>
+          </w:p>
+        </w:tc>
+        <w:tc>
+          <w:tcPr>
+            <w:tcW w:type="dxa" w:w="6900"/>
+            <w:vAlign w:val="top"/>
+          </w:tcPr>
+          <w:p>
+            <w:pPr>
+              <w:spacing w:after="0"/>
+            </w:pPr>
+            <w:r>
+              <w:rPr>
+                <w:rFonts w:ascii="Arial" w:hAnsi="Arial"/>
+                <w:sz w:val="17"/>
+              </w:rPr>
+              <w:t>Root crop/staple food.</w:t>
+            </w:r>
+          </w:p>
+        </w:tc>
+      </w:tr>
+      <w:tr>
+        <w:tc>
+          <w:tcPr>
+            <w:tcW w:type="dxa" w:w="2100"/>
+            <w:vAlign w:val="top"/>
+          </w:tcPr>
+          <w:p>
+            <w:pPr>
+              <w:spacing w:after="0"/>
+            </w:pPr>
+            <w:r>
+              <w:rPr>
+                <w:rFonts w:ascii="Arial" w:hAnsi="Arial"/>
+                <w:sz w:val="17"/>
+              </w:rPr>
+              <w:t>tī</w:t>
+            </w:r>
+            <w:r>
+              <w:t xml:space="preserve"> (TEE)</w:t>
+            </w:r>
+          </w:p>
+        </w:tc>
+        <w:tc>
+          <w:tcPr>
+            <w:tcW w:type="dxa" w:w="6900"/>
+            <w:vAlign w:val="top"/>
+          </w:tcPr>
+          <w:p>
+            <w:pPr>
+              <w:spacing w:after="0"/>
+            </w:pPr>
+            <w:r>
+              <w:rPr>
+                <w:rFonts w:ascii="Arial" w:hAnsi="Arial"/>
+                <w:sz w:val="17"/>
+              </w:rPr>
+              <w:t>Cabbage tree; leaves may be used for skirts, coverings, or other material culture.</w:t>
+            </w:r>
+          </w:p>
+        </w:tc>
+      </w:tr>
+      <w:tr>
+        <w:tc>
+          <w:tcPr>
+            <w:tcW w:type="dxa" w:w="2100"/>
+            <w:vAlign w:val="top"/>
+          </w:tcPr>
+          <w:p>
+            <w:pPr>
+              <w:spacing w:after="0"/>
+            </w:pPr>
+            <w:r>
+              <w:rPr>
+                <w:rFonts w:ascii="Arial" w:hAnsi="Arial"/>
+                <w:sz w:val="17"/>
+              </w:rPr>
+              <w:t>tika</w:t>
+            </w:r>
+            <w:r>
+              <w:t xml:space="preserve"> (TEE-kah)</w:t>
+            </w:r>
+          </w:p>
+        </w:tc>
+        <w:tc>
+          <w:tcPr>
+            <w:tcW w:type="dxa" w:w="6900"/>
+            <w:vAlign w:val="top"/>
+          </w:tcPr>
+          <w:p>
+            <w:pPr>
+              <w:spacing w:after="0"/>
+            </w:pPr>
+            <w:r>
+              <w:rPr>
+                <w:rFonts w:ascii="Arial" w:hAnsi="Arial"/>
+                <w:sz w:val="17"/>
+              </w:rPr>
+              <w:t>Correct, right, proper, just, or fitting.</w:t>
+            </w:r>
+          </w:p>
+        </w:tc>
+      </w:tr>
+      <w:tr>
+        <w:tc>
+          <w:tcPr>
+            <w:tcW w:type="dxa" w:w="2100"/>
+            <w:vAlign w:val="top"/>
+          </w:tcPr>
+          <w:p>
+            <w:pPr>
+              <w:spacing w:after="0"/>
+            </w:pPr>
+            <w:r>
+              <w:rPr>
+                <w:rFonts w:ascii="Arial" w:hAnsi="Arial"/>
+                <w:sz w:val="17"/>
+              </w:rPr>
+              <w:t>toetoe</w:t>
+            </w:r>
+            <w:r>
+              <w:t xml:space="preserve"> (TOH-eh-TOH-eh)</w:t>
+            </w:r>
+          </w:p>
+        </w:tc>
+        <w:tc>
+          <w:tcPr>
+            <w:tcW w:type="dxa" w:w="6900"/>
+            <w:vAlign w:val="top"/>
+          </w:tcPr>
+          <w:p>
+            <w:pPr>
+              <w:spacing w:after="0"/>
+            </w:pPr>
+            <w:r>
+              <w:rPr>
+                <w:rFonts w:ascii="Arial" w:hAnsi="Arial"/>
+                <w:sz w:val="17"/>
+              </w:rPr>
+              <w:t>Reed/grass-like plant or thatch material; in context, sharp blades cut the hand.</w:t>
+            </w:r>
+          </w:p>
+        </w:tc>
+      </w:tr>
+      <w:tr>
+        <w:tc>
+          <w:tcPr>
+            <w:tcW w:type="dxa" w:w="2100"/>
+            <w:vAlign w:val="top"/>
+          </w:tcPr>
+          <w:p>
+            <w:pPr>
+              <w:spacing w:after="0"/>
+            </w:pPr>
+            <w:r>
+              <w:rPr>
+                <w:rFonts w:ascii="Arial" w:hAnsi="Arial"/>
+                <w:sz w:val="17"/>
+              </w:rPr>
+              <w:t>tohunga</w:t>
+            </w:r>
+            <w:r>
+              <w:t xml:space="preserve"> (toh-HUNG-ah)</w:t>
+            </w:r>
+          </w:p>
+        </w:tc>
+        <w:tc>
+          <w:tcPr>
+            <w:tcW w:type="dxa" w:w="6900"/>
+            <w:vAlign w:val="top"/>
+          </w:tcPr>
+          <w:p>
+            <w:pPr>
+              <w:spacing w:after="0"/>
+            </w:pPr>
+            <w:r>
+              <w:rPr>
+                <w:rFonts w:ascii="Arial" w:hAnsi="Arial"/>
+                <w:sz w:val="17"/>
+              </w:rPr>
+              <w:t>Expert, priest, healer, ritual specialist, or keeper of sacred knowledge.</w:t>
+            </w:r>
+          </w:p>
+        </w:tc>
+      </w:tr>
+      <w:tr>
+        <w:tc>
+          <w:tcPr>
+            <w:tcW w:type="dxa" w:w="2100"/>
+            <w:vAlign w:val="top"/>
+          </w:tcPr>
+          <w:p>
+            <w:pPr>
+              <w:spacing w:after="0"/>
+            </w:pPr>
+            <w:r>
+              <w:rPr>
+                <w:rFonts w:ascii="Arial" w:hAnsi="Arial"/>
+                <w:sz w:val="17"/>
+              </w:rPr>
+              <w:t>tōtara</w:t>
+            </w:r>
+            <w:r>
+              <w:t xml:space="preserve"> (TOH-tah-rah)</w:t>
+            </w:r>
+          </w:p>
+        </w:tc>
+        <w:tc>
+          <w:tcPr>
+            <w:tcW w:type="dxa" w:w="6900"/>
+            <w:vAlign w:val="top"/>
+          </w:tcPr>
+          <w:p>
+            <w:pPr>
+              <w:spacing w:after="0"/>
+            </w:pPr>
+            <w:r>
+              <w:rPr>
+                <w:rFonts w:ascii="Arial" w:hAnsi="Arial"/>
+                <w:sz w:val="17"/>
+              </w:rPr>
+              <w:t>Native tree; appears in forest/clearing scenes.</w:t>
+            </w:r>
+          </w:p>
+        </w:tc>
+      </w:tr>
+      <w:tr>
+        <w:tc>
+          <w:tcPr>
+            <w:tcW w:type="dxa" w:w="2100"/>
+            <w:vAlign w:val="top"/>
+          </w:tcPr>
+          <w:p>
+            <w:pPr>
+              <w:spacing w:after="0"/>
+            </w:pPr>
+            <w:r>
+              <w:rPr>
+                <w:rFonts w:ascii="Arial" w:hAnsi="Arial"/>
+                <w:sz w:val="17"/>
+              </w:rPr>
+              <w:t>tūrama</w:t>
+            </w:r>
+            <w:r>
+              <w:t xml:space="preserve"> (TOO-rah-mah)</w:t>
+            </w:r>
+          </w:p>
+        </w:tc>
+        <w:tc>
+          <w:tcPr>
+            <w:tcW w:type="dxa" w:w="6900"/>
+            <w:vAlign w:val="top"/>
+          </w:tcPr>
+          <w:p>
+            <w:pPr>
+              <w:spacing w:after="0"/>
+            </w:pPr>
+            <w:r>
+              <w:rPr>
+                <w:rFonts w:ascii="Arial" w:hAnsi="Arial"/>
+                <w:sz w:val="17"/>
+              </w:rPr>
+              <w:t>In-world yellow dye or plant-dye source used for bright garments.</w:t>
+            </w:r>
+          </w:p>
+        </w:tc>
+      </w:tr>
+      <w:tr>
+        <w:tc>
+          <w:tcPr>
+            <w:tcW w:type="dxa" w:w="2100"/>
+            <w:vAlign w:val="top"/>
+          </w:tcPr>
+          <w:p>
+            <w:pPr>
+              <w:spacing w:after="0"/>
+            </w:pPr>
+            <w:r>
+              <w:rPr>
+                <w:rFonts w:ascii="Arial" w:hAnsi="Arial"/>
+                <w:sz w:val="17"/>
+              </w:rPr>
+              <w:t>utu</w:t>
+            </w:r>
+            <w:r>
+              <w:t xml:space="preserve"> (OO-too)</w:t>
+            </w:r>
+          </w:p>
+        </w:tc>
+        <w:tc>
+          <w:tcPr>
+            <w:tcW w:type="dxa" w:w="6900"/>
+            <w:vAlign w:val="top"/>
+          </w:tcPr>
+          <w:p>
+            <w:pPr>
+              <w:spacing w:after="0"/>
+            </w:pPr>
+            <w:r>
+              <w:rPr>
+                <w:rFonts w:ascii="Arial" w:hAnsi="Arial"/>
+                <w:sz w:val="17"/>
+              </w:rPr>
+              <w:t>Reciprocity, payment, compensation, revenge, or balancing response. In the story it often carries the weight of blood debt and moral balancing.</w:t>
+            </w:r>
+          </w:p>
+        </w:tc>
+      </w:tr>
+      <w:tr>
+        <w:tc>
+          <w:tcPr>
+            <w:tcW w:type="dxa" w:w="2100"/>
+            <w:vAlign w:val="top"/>
+          </w:tcPr>
+          <w:p>
+            <w:pPr>
+              <w:spacing w:after="0"/>
+            </w:pPr>
+            <w:r>
+              <w:t xml:space="preserve">vokai (VOH-kai)</w:t>
+            </w:r>
+          </w:p>
+        </w:tc>
+        <w:tc>
+          <w:tcPr>
+            <w:tcW w:type="dxa" w:w="6900"/>
+            <w:vAlign w:val="top"/>
+          </w:tcPr>
+          <w:p>
+            <w:pPr>
+              <w:spacing w:after="0"/>
+            </w:pPr>
+            <w:r>
+              <w:t xml:space="preserve">The Fijian Vokai iguana; a critically endangered tree-dwelling lizard native to Fiji, known for vibrant emerald green colouring with white and black banding. Can darken its skin to near-black when stressed or threatened.</w:t>
+            </w:r>
+          </w:p>
+        </w:tc>
+      </w:tr>
+      <w:tr>
+        <w:tc>
+          <w:tcPr>
+            <w:tcW w:type="dxa" w:w="2100"/>
+            <w:vAlign w:val="top"/>
+          </w:tcPr>
+          <w:p>
+            <w:pPr>
+              <w:spacing w:after="0"/>
+            </w:pPr>
+            <w:r>
+              <w:rPr>
+                <w:rFonts w:ascii="Arial" w:hAnsi="Arial"/>
+                <w:sz w:val="17"/>
+              </w:rPr>
+              <w:t>wairua</w:t>
+            </w:r>
+            <w:r>
+              <w:t xml:space="preserve"> (wai-ROO-ah)</w:t>
+            </w:r>
+          </w:p>
+        </w:tc>
+        <w:tc>
+          <w:tcPr>
+            <w:tcW w:type="dxa" w:w="6900"/>
+            <w:vAlign w:val="top"/>
+          </w:tcPr>
+          <w:p>
+            <w:pPr>
+              <w:spacing w:after="0"/>
+            </w:pPr>
+            <w:r>
+              <w:rPr>
+                <w:rFonts w:ascii="Arial" w:hAnsi="Arial"/>
+                <w:sz w:val="17"/>
+              </w:rPr>
+              <w:t>Spirit or soul. In the manuscript, often used when body, memory, and spiritual self separate or return.</w:t>
+            </w:r>
+          </w:p>
+        </w:tc>
+      </w:tr>
+      <w:tr>
+        <w:tc>
+          <w:tcPr>
+            <w:tcW w:type="dxa" w:w="2100"/>
+            <w:vAlign w:val="top"/>
+          </w:tcPr>
+          <w:p>
+            <w:pPr>
+              <w:spacing w:after="0"/>
+            </w:pPr>
+            <w:r>
+              <w:rPr>
+                <w:rFonts w:ascii="Arial" w:hAnsi="Arial"/>
+                <w:sz w:val="17"/>
+              </w:rPr>
+              <w:t>waka</w:t>
+            </w:r>
+            <w:r>
+              <w:t xml:space="preserve"> (WAH-kah)</w:t>
+            </w:r>
+          </w:p>
+        </w:tc>
+        <w:tc>
+          <w:tcPr>
+            <w:tcW w:type="dxa" w:w="6900"/>
+            <w:vAlign w:val="top"/>
+          </w:tcPr>
+          <w:p>
+            <w:pPr>
+              <w:spacing w:after="0"/>
+            </w:pPr>
+            <w:r>
+              <w:rPr>
+                <w:rFonts w:ascii="Arial" w:hAnsi="Arial"/>
+                <w:sz w:val="17"/>
+              </w:rPr>
+              <w:t>Canoe or vessel. Central to travel, exile, return, and ocean navigation.</w:t>
+            </w:r>
+          </w:p>
+        </w:tc>
+      </w:tr>
+      <w:tr>
+        <w:tc>
+          <w:tcPr>
+            <w:tcW w:type="dxa" w:w="2100"/>
+            <w:vAlign w:val="top"/>
+          </w:tcPr>
+          <w:p>
+            <w:pPr>
+              <w:spacing w:after="0"/>
+            </w:pPr>
+            <w:r>
+              <w:t xml:space="preserve">whakapapa (fah-kah-PAH-pah)</w:t>
+            </w:r>
+          </w:p>
+        </w:tc>
+        <w:tc>
+          <w:tcPr>
+            <w:tcW w:type="dxa" w:w="6900"/>
+            <w:vAlign w:val="top"/>
+          </w:tcPr>
+          <w:p>
+            <w:pPr>
+              <w:spacing w:after="0"/>
+            </w:pPr>
+            <w:r>
+              <w:t xml:space="preserve">Genealogy; the layering of one generation upon another. Recitation of ancestral lineage establishes identity, standing, and spiritual connection. Ho’s uncertainty about his whakapapa is central to his crisis of belonging.</w:t>
+            </w:r>
+          </w:p>
+        </w:tc>
+      </w:tr>
+      <w:tr>
+        <w:tc>
+          <w:tcPr>
+            <w:tcW w:type="dxa" w:w="2100"/>
+            <w:vAlign w:val="top"/>
+          </w:tcPr>
+          <w:p>
+            <w:pPr>
+              <w:spacing w:after="0"/>
+            </w:pPr>
+            <w:r>
+              <w:rPr>
+                <w:rFonts w:ascii="Arial" w:hAnsi="Arial"/>
+                <w:sz w:val="17"/>
+              </w:rPr>
+              <w:t>whakataukī</w:t>
+            </w:r>
+            <w:r>
+              <w:t xml:space="preserve"> (fah-kah-TOW-kee)</w:t>
+            </w:r>
+          </w:p>
+        </w:tc>
+        <w:tc>
+          <w:tcPr>
+            <w:tcW w:type="dxa" w:w="6900"/>
+            <w:vAlign w:val="top"/>
+          </w:tcPr>
+          <w:p>
+            <w:pPr>
+              <w:spacing w:after="0"/>
+            </w:pPr>
+            <w:r>
+              <w:rPr>
+                <w:rFonts w:ascii="Arial" w:hAnsi="Arial"/>
+                <w:sz w:val="17"/>
+              </w:rPr>
+              <w:t>Proverb or proverbial saying.</w:t>
+            </w:r>
+          </w:p>
+        </w:tc>
+      </w:tr>
+      <w:tr>
+        <w:tc>
+          <w:tcPr>
+            <w:tcW w:type="dxa" w:w="2100"/>
+            <w:vAlign w:val="top"/>
+          </w:tcPr>
+          <w:p>
+            <w:pPr>
+              <w:spacing w:after="0"/>
+            </w:pPr>
+            <w:r>
+              <w:rPr>
+                <w:rFonts w:ascii="Arial" w:hAnsi="Arial"/>
+                <w:sz w:val="17"/>
+              </w:rPr>
               <w:t>whāriki</w:t>
+            </w:r>
+            <w:r>
+              <w:t xml:space="preserve"> (FAH-ree-kee)</w:t>
             </w:r>
           </w:p>
         </w:tc>
@@ -2327,6 +2998,9 @@
               </w:rPr>
               <w:t>Ārohirohi</w:t>
             </w:r>
+            <w:r>
+              <w:t xml:space="preserve"> (AH-roh-hee-roh-hee)</w:t>
+            </w:r>
           </w:p>
         </w:tc>
         <w:tc>
@@ -2365,6 +3039,9 @@
               </w:rPr>
               <w:t>Feke</w:t>
             </w:r>
+            <w:r>
+              <w:t xml:space="preserve"> (FEH-keh)</w:t>
+            </w:r>
           </w:p>
         </w:tc>
         <w:tc>
@@ -2403,6 +3080,9 @@
               </w:rPr>
               <w:t>Feke and Rapa-Iti</w:t>
             </w:r>
+            <w:r>
+              <w:t xml:space="preserve"> (FEH-keh and RAH-pah-EE-tee)</w:t>
+            </w:r>
           </w:p>
         </w:tc>
         <w:tc>
@@ -2435,11 +3115,7 @@
               <w:spacing w:after="0"/>
             </w:pPr>
             <w:r>
-              <w:rPr>
-                <w:rFonts w:ascii="Arial" w:hAnsi="Arial"/>
-                <w:sz w:val="17"/>
-              </w:rPr>
-              <w:t>Io</w:t>
+              <w:t xml:space="preserve">Haronga (hah-RONG-ah)</w:t>
             </w:r>
           </w:p>
         </w:tc>
@@ -2453,11 +3129,7 @@
               <w:spacing w:after="0"/>
             </w:pPr>
             <w:r>
-              <w:rPr>
-                <w:rFonts w:ascii="Arial" w:hAnsi="Arial"/>
-                <w:sz w:val="17"/>
-              </w:rPr>
-              <w:t>Supreme divine figure referenced as a creator/source above other atua.</w:t>
+              <w:t xml:space="preserve">Dawn god; atua of warmth and the first light of day. In the manuscript, Ho wonders whether Haronga has opened his eyes to witness the tears in the sky—unsettled to be watched by a god he had barely considered.</w:t>
             </w:r>
           </w:p>
         </w:tc>
@@ -2477,7 +3149,10 @@
                 <w:rFonts w:ascii="Arial" w:hAnsi="Arial"/>
                 <w:sz w:val="17"/>
               </w:rPr>
-              <w:t>Mailagu</w:t>
+              <w:t>Io</w:t>
+            </w:r>
+            <w:r>
+              <w:t xml:space="preserve"> (EE-oh)</w:t>
             </w:r>
           </w:p>
         </w:tc>
@@ -2495,7 +3170,7 @@
                 <w:rFonts w:ascii="Arial" w:hAnsi="Arial"/>
                 <w:sz w:val="17"/>
               </w:rPr>
-              <w:t>Sky/blue-veil goddess in the manuscript.</w:t>
+              <w:t>Supreme divine figure referenced as a creator/source above other atua.</w:t>
             </w:r>
           </w:p>
         </w:tc>
@@ -2515,7 +3190,10 @@
                 <w:rFonts w:ascii="Arial" w:hAnsi="Arial"/>
                 <w:sz w:val="17"/>
               </w:rPr>
-              <w:t>Mārama</w:t>
+              <w:t>Mailagu</w:t>
+            </w:r>
+            <w:r>
+              <w:t xml:space="preserve"> (mai-LAH-goo)</w:t>
             </w:r>
           </w:p>
         </w:tc>
@@ -2533,7 +3211,7 @@
                 <w:rFonts w:ascii="Arial" w:hAnsi="Arial"/>
                 <w:sz w:val="17"/>
               </w:rPr>
-              <w:t>Moon goddess in the manuscript's ritual context.</w:t>
+              <w:t>Sky/blue-veil goddess in the manuscript.</w:t>
             </w:r>
           </w:p>
         </w:tc>
@@ -2553,7 +3231,10 @@
                 <w:rFonts w:ascii="Arial" w:hAnsi="Arial"/>
                 <w:sz w:val="17"/>
               </w:rPr>
-              <w:t>Māui</w:t>
+              <w:t>Mārama</w:t>
+            </w:r>
+            <w:r>
+              <w:t xml:space="preserve"> (MAH-rah-mah)</w:t>
             </w:r>
           </w:p>
         </w:tc>
@@ -2571,7 +3252,7 @@
                 <w:rFonts w:ascii="Arial" w:hAnsi="Arial"/>
                 <w:sz w:val="17"/>
               </w:rPr>
-              <w:t>Culture hero referenced through comparison and memory.</w:t>
+              <w:t>Moon goddess in the manuscript's ritual context.</w:t>
             </w:r>
           </w:p>
         </w:tc>
@@ -2591,7 +3272,10 @@
                 <w:rFonts w:ascii="Arial" w:hAnsi="Arial"/>
                 <w:sz w:val="17"/>
               </w:rPr>
-              <w:t>Papatūānuku</w:t>
+              <w:t>Māui</w:t>
+            </w:r>
+            <w:r>
+              <w:t xml:space="preserve"> (MAH-oo-ee)</w:t>
             </w:r>
           </w:p>
         </w:tc>
@@ -2609,7 +3293,7 @@
                 <w:rFonts w:ascii="Arial" w:hAnsi="Arial"/>
                 <w:sz w:val="17"/>
               </w:rPr>
-              <w:t>Earth mother.</w:t>
+              <w:t>Culture hero referenced through comparison and memory.</w:t>
             </w:r>
           </w:p>
         </w:tc>
@@ -2629,7 +3313,10 @@
                 <w:rFonts w:ascii="Arial" w:hAnsi="Arial"/>
                 <w:sz w:val="17"/>
               </w:rPr>
-              <w:t>Rā</w:t>
+              <w:t>Papatūānuku</w:t>
+            </w:r>
+            <w:r>
+              <w:t xml:space="preserve"> (pah-pah-TOO-AH-noo-koo)</w:t>
             </w:r>
           </w:p>
         </w:tc>
@@ -2647,7 +3334,7 @@
                 <w:rFonts w:ascii="Arial" w:hAnsi="Arial"/>
                 <w:sz w:val="17"/>
               </w:rPr>
-              <w:t>Sun or sun-associated deity.</w:t>
+              <w:t>Earth mother.</w:t>
             </w:r>
           </w:p>
         </w:tc>
@@ -2667,7 +3354,10 @@
                 <w:rFonts w:ascii="Arial" w:hAnsi="Arial"/>
                 <w:sz w:val="17"/>
               </w:rPr>
-              <w:t>Ranginui</w:t>
+              <w:t>Rā</w:t>
+            </w:r>
+            <w:r>
+              <w:t xml:space="preserve"> (RAH)</w:t>
             </w:r>
           </w:p>
         </w:tc>
@@ -2685,7 +3375,7 @@
                 <w:rFonts w:ascii="Arial" w:hAnsi="Arial"/>
                 <w:sz w:val="17"/>
               </w:rPr>
-              <w:t>Sky father.</w:t>
+              <w:t>Sun or sun-associated deity.</w:t>
             </w:r>
           </w:p>
         </w:tc>
@@ -2705,7 +3395,10 @@
                 <w:rFonts w:ascii="Arial" w:hAnsi="Arial"/>
                 <w:sz w:val="17"/>
               </w:rPr>
-              <w:t>Rongo</w:t>
+              <w:t>Ranginui</w:t>
+            </w:r>
+            <w:r>
+              <w:t xml:space="preserve"> (RANG-ee-noo-ee)</w:t>
             </w:r>
           </w:p>
         </w:tc>
@@ -2723,7 +3416,7 @@
                 <w:rFonts w:ascii="Arial" w:hAnsi="Arial"/>
                 <w:sz w:val="17"/>
               </w:rPr>
-              <w:t>Peace, agriculture, and fertile garden-associated atua.</w:t>
+              <w:t>Sky father.</w:t>
             </w:r>
           </w:p>
         </w:tc>
@@ -2743,7 +3436,10 @@
                 <w:rFonts w:ascii="Arial" w:hAnsi="Arial"/>
                 <w:sz w:val="17"/>
               </w:rPr>
-              <w:t>Takali Foto</w:t>
+              <w:t>Rongo</w:t>
+            </w:r>
+            <w:r>
+              <w:t xml:space="preserve"> (RONG-oh)</w:t>
             </w:r>
           </w:p>
         </w:tc>
@@ -2761,7 +3457,7 @@
                 <w:rFonts w:ascii="Arial" w:hAnsi="Arial"/>
                 <w:sz w:val="17"/>
               </w:rPr>
-              <w:t>Volcano god/mountain; a place, a divine presence, and a prophetic threat.</w:t>
+              <w:t>Peace, agriculture, and fertile garden-associated atua.</w:t>
             </w:r>
           </w:p>
         </w:tc>
@@ -2781,7 +3477,10 @@
                 <w:rFonts w:ascii="Arial" w:hAnsi="Arial"/>
                 <w:sz w:val="17"/>
               </w:rPr>
-              <w:t>Takaroa</w:t>
+              <w:t>Takali Foto</w:t>
+            </w:r>
+            <w:r>
+              <w:t xml:space="preserve"> (tah-KAH-lee FOH-toh)</w:t>
             </w:r>
           </w:p>
         </w:tc>
@@ -2799,7 +3498,7 @@
                 <w:rFonts w:ascii="Arial" w:hAnsi="Arial"/>
                 <w:sz w:val="17"/>
               </w:rPr>
-              <w:t>Sea/ocean god associated with Ho, the ocean, and divine ancestry.</w:t>
+              <w:t>Volcano god/mountain; a place, a divine presence, and a prophetic threat.</w:t>
             </w:r>
           </w:p>
         </w:tc>
@@ -2819,7 +3518,10 @@
                 <w:rFonts w:ascii="Arial" w:hAnsi="Arial"/>
                 <w:sz w:val="17"/>
               </w:rPr>
-              <w:t>Tāne / Tāne-Mahuta</w:t>
+              <w:t>Takaroa</w:t>
+            </w:r>
+            <w:r>
+              <w:t xml:space="preserve"> (tah-kah-ROH-ah)</w:t>
             </w:r>
           </w:p>
         </w:tc>
@@ -2837,7 +3539,7 @@
                 <w:rFonts w:ascii="Arial" w:hAnsi="Arial"/>
                 <w:sz w:val="17"/>
               </w:rPr>
-              <w:t>Forest god; associated with trees and the living forest.</w:t>
+              <w:t>Sea/ocean god associated with Ho, the ocean, and divine ancestry.</w:t>
             </w:r>
           </w:p>
         </w:tc>
@@ -2857,7 +3559,10 @@
                 <w:rFonts w:ascii="Arial" w:hAnsi="Arial"/>
                 <w:sz w:val="17"/>
               </w:rPr>
-              <w:t>Tāwhiri / Tāwhirimātea</w:t>
+              <w:t>Tāne / Tāne-Mahuta</w:t>
+            </w:r>
+            <w:r>
+              <w:t xml:space="preserve"> (TAH-neh / TAH-neh-mah-HOO-tah)</w:t>
             </w:r>
           </w:p>
         </w:tc>
@@ -2875,7 +3580,7 @@
                 <w:rFonts w:ascii="Arial" w:hAnsi="Arial"/>
                 <w:sz w:val="17"/>
               </w:rPr>
-              <w:t>Wind or storm god. `Tāwhirimātea` is the fuller Maori deity name; manuscript also uses shortened `Tāwhiri`.</w:t>
+              <w:t>Forest god; associated with trees and the living forest.</w:t>
             </w:r>
           </w:p>
         </w:tc>
@@ -2895,7 +3600,10 @@
                 <w:rFonts w:ascii="Arial" w:hAnsi="Arial"/>
                 <w:sz w:val="17"/>
               </w:rPr>
-              <w:t>Tokoroa</w:t>
+              <w:t>Tāwhiri / Tāwhirimātea</w:t>
+            </w:r>
+            <w:r>
+              <w:t xml:space="preserve"> (TAH-fee-ree / TAH-fee-ree-MAH-teh-ah)</w:t>
             </w:r>
           </w:p>
         </w:tc>
@@ -2913,7 +3621,7 @@
                 <w:rFonts w:ascii="Arial" w:hAnsi="Arial"/>
                 <w:sz w:val="17"/>
               </w:rPr>
-              <w:t>Variant/error form appearing in early ocean-counsel references.</w:t>
+              <w:t>Wind or storm god. `Tāwhirimātea` is the fuller Maori deity name; manuscript also uses shortened `Tāwhiri`.</w:t>
             </w:r>
           </w:p>
         </w:tc>
@@ -2933,7 +3641,10 @@
                 <w:rFonts w:ascii="Arial" w:hAnsi="Arial"/>
                 <w:sz w:val="17"/>
               </w:rPr>
-              <w:t>Tū</w:t>
+              <w:t>Tokoroa</w:t>
+            </w:r>
+            <w:r>
+              <w:t xml:space="preserve"> (toh-koh-ROH-ah)</w:t>
             </w:r>
           </w:p>
         </w:tc>
@@ -2951,7 +3662,7 @@
                 <w:rFonts w:ascii="Arial" w:hAnsi="Arial"/>
                 <w:sz w:val="17"/>
               </w:rPr>
-              <w:t>War/humankind-associated atua, invoked among Ho's carved gods.</w:t>
+              <w:t>Variant/error form appearing in early ocean-counsel references.</w:t>
             </w:r>
           </w:p>
         </w:tc>
@@ -2971,7 +3682,51 @@
                 <w:rFonts w:ascii="Arial" w:hAnsi="Arial"/>
                 <w:sz w:val="17"/>
               </w:rPr>
+              <w:t>Tū</w:t>
+            </w:r>
+            <w:r>
+              <w:t xml:space="preserve"> (TOO)</w:t>
+            </w:r>
+          </w:p>
+        </w:tc>
+        <w:tc>
+          <w:tcPr>
+            <w:tcW w:type="dxa" w:w="6900"/>
+            <w:vAlign w:val="top"/>
+          </w:tcPr>
+          <w:p>
+            <w:pPr>
+              <w:spacing w:after="0"/>
+            </w:pPr>
+            <w:r>
+              <w:rPr>
+                <w:rFonts w:ascii="Arial" w:hAnsi="Arial"/>
+                <w:sz w:val="17"/>
+              </w:rPr>
+              <w:t>War/humankind-associated atua, invoked among Ho's carved gods.</w:t>
+            </w:r>
+          </w:p>
+        </w:tc>
+      </w:tr>
+      <w:tr>
+        <w:tc>
+          <w:tcPr>
+            <w:tcW w:type="dxa" w:w="2100"/>
+            <w:vAlign w:val="top"/>
+          </w:tcPr>
+          <w:p>
+            <w:pPr>
+              <w:spacing w:after="0"/>
+            </w:pPr>
+            <w:r>
+              <w:rPr>
+                <w:rFonts w:ascii="Arial" w:hAnsi="Arial"/>
+                <w:sz w:val="17"/>
+              </w:rPr>
               <w:t>Wātea</w:t>
+            </w:r>
+            <w:r>
+              <w:t xml:space="preserve"> (WAH-teh-ah)</w:t>
             </w:r>
           </w:p>
         </w:tc>
@@ -3071,6 +3826,9 @@
               </w:rPr>
               <w:t>Ahukai</w:t>
             </w:r>
+            <w:r>
+              <w:t xml:space="preserve"> (ah-HOO-kai)</w:t>
+            </w:r>
           </w:p>
         </w:tc>
         <w:tc>
@@ -3109,6 +3867,9 @@
               </w:rPr>
               <w:t>Autara</w:t>
             </w:r>
+            <w:r>
+              <w:t xml:space="preserve"> (ow-TAH-rah)</w:t>
+            </w:r>
           </w:p>
         </w:tc>
         <w:tc>
@@ -3147,6 +3908,9 @@
               </w:rPr>
               <w:t>Feke</w:t>
             </w:r>
+            <w:r>
+              <w:t xml:space="preserve"> (FEH-keh)</w:t>
+            </w:r>
           </w:p>
         </w:tc>
         <w:tc>
@@ -3185,6 +3949,9 @@
               </w:rPr>
               <w:t>Ho's atoll</w:t>
             </w:r>
+            <w:r>
+              <w:t xml:space="preserve"> (HOH's ah-TOL)</w:t>
+            </w:r>
           </w:p>
         </w:tc>
         <w:tc>
@@ -3223,6 +3990,9 @@
               </w:rPr>
               <w:t>Kafiki</w:t>
             </w:r>
+            <w:r>
+              <w:t xml:space="preserve"> (kah-FEE-kee)</w:t>
+            </w:r>
           </w:p>
         </w:tc>
         <w:tc>
@@ -3261,6 +4031,9 @@
               </w:rPr>
               <w:t>Kafiki Motu</w:t>
             </w:r>
+            <w:r>
+              <w:t xml:space="preserve"> (kah-FEE-kee MOH-too)</w:t>
+            </w:r>
           </w:p>
         </w:tc>
         <w:tc>
@@ -3293,11 +4066,7 @@
               <w:spacing w:after="0"/>
             </w:pPr>
             <w:r>
-              <w:rPr>
-                <w:rFonts w:ascii="Arial" w:hAnsi="Arial"/>
-                <w:sz w:val="17"/>
-              </w:rPr>
-              <w:t>Lidopo</w:t>
+              <w:t xml:space="preserve">Lapita (lah-PEE-tah)</w:t>
             </w:r>
           </w:p>
         </w:tc>
@@ -3311,11 +4080,7 @@
               <w:spacing w:after="0"/>
             </w:pPr>
             <w:r>
-              <w:rPr>
-                <w:rFonts w:ascii="Arial" w:hAnsi="Arial"/>
-                <w:sz w:val="17"/>
-              </w:rPr>
-              <w:t>Place/people named in later intertribal context.</w:t>
+              <w:t xml:space="preserve">The Lapita people; ancient seafarers whose distinctive pottery tradition marks the earliest known settlement of western Polynesia, c. 1600–500 BCE. Referenced in the manuscript as a historical antecedent to the world of Kafiki.</w:t>
             </w:r>
           </w:p>
         </w:tc>
@@ -3335,7 +4100,10 @@
                 <w:rFonts w:ascii="Arial" w:hAnsi="Arial"/>
                 <w:sz w:val="17"/>
               </w:rPr>
-              <w:t>Mahana</w:t>
+              <w:t>Lidopo</w:t>
+            </w:r>
+            <w:r>
+              <w:t xml:space="preserve"> (lee-DOH-poh)</w:t>
             </w:r>
           </w:p>
         </w:tc>
@@ -3353,7 +4121,7 @@
                 <w:rFonts w:ascii="Arial" w:hAnsi="Arial"/>
                 <w:sz w:val="17"/>
               </w:rPr>
-              <w:t>Ranges/area named in Matavai geography.</w:t>
+              <w:t>Place/people named in later intertribal context.</w:t>
             </w:r>
           </w:p>
         </w:tc>
@@ -3373,7 +4141,10 @@
                 <w:rFonts w:ascii="Arial" w:hAnsi="Arial"/>
                 <w:sz w:val="17"/>
               </w:rPr>
-              <w:t>Makateā</w:t>
+              <w:t>Mahana</w:t>
+            </w:r>
+            <w:r>
+              <w:t xml:space="preserve"> (mah-HAH-nah)</w:t>
             </w:r>
           </w:p>
         </w:tc>
@@ -3391,7 +4162,7 @@
                 <w:rFonts w:ascii="Arial" w:hAnsi="Arial"/>
                 <w:sz w:val="17"/>
               </w:rPr>
-              <w:t>Distant people or tribe associated with Rapa-Iti.</w:t>
+              <w:t>Ranges/area named in Matavai geography.</w:t>
             </w:r>
           </w:p>
         </w:tc>
@@ -3411,7 +4182,10 @@
                 <w:rFonts w:ascii="Arial" w:hAnsi="Arial"/>
                 <w:sz w:val="17"/>
               </w:rPr>
-              <w:t>Makateān</w:t>
+              <w:t>Makateā</w:t>
+            </w:r>
+            <w:r>
+              <w:t xml:space="preserve"> (mah-kah-TEH-ah)</w:t>
             </w:r>
           </w:p>
         </w:tc>
@@ -3429,7 +4203,7 @@
                 <w:rFonts w:ascii="Arial" w:hAnsi="Arial"/>
                 <w:sz w:val="17"/>
               </w:rPr>
-              <w:t>Adjectival form referring to the Makateā people or their motifs.</w:t>
+              <w:t>Distant people or tribe associated with Rapa-Iti.</w:t>
             </w:r>
           </w:p>
         </w:tc>
@@ -3449,7 +4223,10 @@
                 <w:rFonts w:ascii="Arial" w:hAnsi="Arial"/>
                 <w:sz w:val="17"/>
               </w:rPr>
-              <w:t>Matalagi</w:t>
+              <w:t>Makateān</w:t>
+            </w:r>
+            <w:r>
+              <w:t xml:space="preserve"> (mah-kah-TEH-an)</w:t>
             </w:r>
           </w:p>
         </w:tc>
@@ -3467,7 +4244,7 @@
                 <w:rFonts w:ascii="Arial" w:hAnsi="Arial"/>
                 <w:sz w:val="17"/>
               </w:rPr>
-              <w:t>Great meeting fale; glossed in manuscript as `Beautiful Cloak`.</w:t>
+              <w:t>Adjectival form referring to the Makateā people or their motifs.</w:t>
             </w:r>
           </w:p>
         </w:tc>
@@ -3487,7 +4264,10 @@
                 <w:rFonts w:ascii="Arial" w:hAnsi="Arial"/>
                 <w:sz w:val="17"/>
               </w:rPr>
-              <w:t>Matavai</w:t>
+              <w:t>Matalagi</w:t>
+            </w:r>
+            <w:r>
+              <w:t xml:space="preserve"> (mah-tah-LAH-gee)</w:t>
             </w:r>
           </w:p>
         </w:tc>
@@ -3505,7 +4285,7 @@
                 <w:rFonts w:ascii="Arial" w:hAnsi="Arial"/>
                 <w:sz w:val="17"/>
               </w:rPr>
-              <w:t>Powerful tribe/rohe tied to Chief Kuanua, Selai, Teā, and the Waimate River.</w:t>
+              <w:t>Great meeting fale; glossed in manuscript as `Beautiful Cloak`.</w:t>
             </w:r>
           </w:p>
         </w:tc>
@@ -3525,7 +4305,10 @@
                 <w:rFonts w:ascii="Arial" w:hAnsi="Arial"/>
                 <w:sz w:val="17"/>
               </w:rPr>
-              <w:t>Na-Mala-o-Kala‘i</w:t>
+              <w:t>Matavai</w:t>
+            </w:r>
+            <w:r>
+              <w:t xml:space="preserve"> (mah-tah-VAI)</w:t>
             </w:r>
           </w:p>
         </w:tc>
@@ -3543,7 +4326,7 @@
                 <w:rFonts w:ascii="Arial" w:hAnsi="Arial"/>
                 <w:sz w:val="17"/>
               </w:rPr>
-              <w:t>Goddess of Water and the Sea who gives Ho knowledge of the mana beneath his skin.</w:t>
+              <w:t>Powerful tribe/rohe tied to Chief Kuanua, Selai, Teā, and the Waimate River.</w:t>
             </w:r>
           </w:p>
         </w:tc>
@@ -3563,7 +4346,10 @@
                 <w:rFonts w:ascii="Arial" w:hAnsi="Arial"/>
                 <w:sz w:val="17"/>
               </w:rPr>
-              <w:t>Nasara</w:t>
+              <w:t>Na-Mala-o-Kala‘i</w:t>
+            </w:r>
+            <w:r>
+              <w:t xml:space="preserve"> (nah-MAH-lah-oh-kah-LAH-ee)</w:t>
             </w:r>
           </w:p>
         </w:tc>
@@ -3581,7 +4367,7 @@
                 <w:rFonts w:ascii="Arial" w:hAnsi="Arial"/>
                 <w:sz w:val="17"/>
               </w:rPr>
-              <w:t>Place name appearing later in the manuscript.</w:t>
+              <w:t>Goddess of Water and the Sea who gives Ho knowledge of the mana beneath his skin.</w:t>
             </w:r>
           </w:p>
         </w:tc>
@@ -3601,7 +4387,10 @@
                 <w:rFonts w:ascii="Arial" w:hAnsi="Arial"/>
                 <w:sz w:val="17"/>
               </w:rPr>
-              <w:t>Rapa-Iti</w:t>
+              <w:t>Nasara</w:t>
+            </w:r>
+            <w:r>
+              <w:t xml:space="preserve"> (nah-SAH-rah)</w:t>
             </w:r>
           </w:p>
         </w:tc>
@@ -3619,7 +4408,7 @@
                 <w:rFonts w:ascii="Arial" w:hAnsi="Arial"/>
                 <w:sz w:val="17"/>
               </w:rPr>
-              <w:t>Distant place/people; also appears in supernatural/taniwha-god references.</w:t>
+              <w:t>Place name appearing later in the manuscript.</w:t>
             </w:r>
           </w:p>
         </w:tc>
@@ -3639,7 +4428,10 @@
                 <w:rFonts w:ascii="Arial" w:hAnsi="Arial"/>
                 <w:sz w:val="17"/>
               </w:rPr>
-              <w:t>Takaroans</w:t>
+              <w:t>Rapa-Iti</w:t>
+            </w:r>
+            <w:r>
+              <w:t xml:space="preserve"> (RAH-pah-EE-tee)</w:t>
             </w:r>
           </w:p>
         </w:tc>
@@ -3657,7 +4449,7 @@
                 <w:rFonts w:ascii="Arial" w:hAnsi="Arial"/>
                 <w:sz w:val="17"/>
               </w:rPr>
-              <w:t>People of Feke Motu associated with Feke and the Takaroa/Feke tradition.</w:t>
+              <w:t>Distant place/people; also appears in supernatural/taniwha-god references.</w:t>
             </w:r>
           </w:p>
         </w:tc>
@@ -3677,7 +4469,10 @@
                 <w:rFonts w:ascii="Arial" w:hAnsi="Arial"/>
                 <w:sz w:val="17"/>
               </w:rPr>
-              <w:t>Tuakau</w:t>
+              <w:t>Takaroans</w:t>
+            </w:r>
+            <w:r>
+              <w:t xml:space="preserve"> (tah-kah-ROH-anz)</w:t>
             </w:r>
           </w:p>
         </w:tc>
@@ -3695,7 +4490,7 @@
                 <w:rFonts w:ascii="Arial" w:hAnsi="Arial"/>
                 <w:sz w:val="17"/>
               </w:rPr>
-              <w:t>Village/place reached during tracking scenes.</w:t>
+              <w:t>People of Feke Motu associated with Feke and the Takaroa/Feke tradition.</w:t>
             </w:r>
           </w:p>
         </w:tc>
@@ -3715,7 +4510,10 @@
                 <w:rFonts w:ascii="Arial" w:hAnsi="Arial"/>
                 <w:sz w:val="17"/>
               </w:rPr>
-              <w:t>Tumutumu</w:t>
+              <w:t>Tuakau</w:t>
+            </w:r>
+            <w:r>
+              <w:t xml:space="preserve"> (too-AH-kow)</w:t>
             </w:r>
           </w:p>
         </w:tc>
@@ -3733,7 +4531,7 @@
                 <w:rFonts w:ascii="Arial" w:hAnsi="Arial"/>
                 <w:sz w:val="17"/>
               </w:rPr>
-              <w:t>One of the Kafiki tribes named in tribal gatherings/prophecy.</w:t>
+              <w:t>Village/place reached during tracking scenes.</w:t>
             </w:r>
           </w:p>
         </w:tc>
@@ -3753,7 +4551,10 @@
                 <w:rFonts w:ascii="Arial" w:hAnsi="Arial"/>
                 <w:sz w:val="17"/>
               </w:rPr>
-              <w:t>Ulu Waimate</w:t>
+              <w:t>Tumutumu</w:t>
+            </w:r>
+            <w:r>
+              <w:t xml:space="preserve"> (too-moo-TOO-moo)</w:t>
             </w:r>
           </w:p>
         </w:tc>
@@ -3771,7 +4572,7 @@
                 <w:rFonts w:ascii="Arial" w:hAnsi="Arial"/>
                 <w:sz w:val="17"/>
               </w:rPr>
-              <w:t>Falls/landmark central to Teā, Kura, and the Baby Eater thread.</w:t>
+              <w:t>One of the Kafiki tribes named in tribal gatherings/prophecy.</w:t>
             </w:r>
           </w:p>
         </w:tc>
@@ -3791,7 +4592,10 @@
                 <w:rFonts w:ascii="Arial" w:hAnsi="Arial"/>
                 <w:sz w:val="17"/>
               </w:rPr>
-              <w:t>Unusi</w:t>
+              <w:t>Ulu Waimate</w:t>
+            </w:r>
+            <w:r>
+              <w:t xml:space="preserve"> (OO-loo wai-MAH-teh)</w:t>
             </w:r>
           </w:p>
         </w:tc>
@@ -3809,7 +4613,7 @@
                 <w:rFonts w:ascii="Arial" w:hAnsi="Arial"/>
                 <w:sz w:val="17"/>
               </w:rPr>
-              <w:t>One of the Kafiki tribes named in tribal gatherings/prophecy.</w:t>
+              <w:t>Falls/landmark central to Teā, Kura, and the Baby Eater thread.</w:t>
             </w:r>
           </w:p>
         </w:tc>
@@ -3829,7 +4633,10 @@
                 <w:rFonts w:ascii="Arial" w:hAnsi="Arial"/>
                 <w:sz w:val="17"/>
               </w:rPr>
-              <w:t>Vanua</w:t>
+              <w:t>Unusi</w:t>
+            </w:r>
+            <w:r>
+              <w:t xml:space="preserve"> (oo-NOO-see)</w:t>
             </w:r>
           </w:p>
         </w:tc>
@@ -3847,7 +4654,7 @@
                 <w:rFonts w:ascii="Arial" w:hAnsi="Arial"/>
                 <w:sz w:val="17"/>
               </w:rPr>
-              <w:t>Place/people term appearing later in the manuscript; in wider Polynesian usage often relates to land/people/place.</w:t>
+              <w:t>One of the Kafiki tribes named in tribal gatherings/prophecy.</w:t>
             </w:r>
           </w:p>
         </w:tc>
@@ -3867,7 +4674,51 @@
                 <w:rFonts w:ascii="Arial" w:hAnsi="Arial"/>
                 <w:sz w:val="17"/>
               </w:rPr>
+              <w:t>Vanua</w:t>
+            </w:r>
+            <w:r>
+              <w:t xml:space="preserve"> (VAH-noo-ah)</w:t>
+            </w:r>
+          </w:p>
+        </w:tc>
+        <w:tc>
+          <w:tcPr>
+            <w:tcW w:type="dxa" w:w="6900"/>
+            <w:vAlign w:val="top"/>
+          </w:tcPr>
+          <w:p>
+            <w:pPr>
+              <w:spacing w:after="0"/>
+            </w:pPr>
+            <w:r>
+              <w:rPr>
+                <w:rFonts w:ascii="Arial" w:hAnsi="Arial"/>
+                <w:sz w:val="17"/>
+              </w:rPr>
+              <w:t>Place/people term appearing later in the manuscript; in wider Polynesian usage often relates to land/people/place.</w:t>
+            </w:r>
+          </w:p>
+        </w:tc>
+      </w:tr>
+      <w:tr>
+        <w:tc>
+          <w:tcPr>
+            <w:tcW w:type="dxa" w:w="2100"/>
+            <w:vAlign w:val="top"/>
+          </w:tcPr>
+          <w:p>
+            <w:pPr>
+              <w:spacing w:after="0"/>
+            </w:pPr>
+            <w:r>
+              <w:rPr>
+                <w:rFonts w:ascii="Arial" w:hAnsi="Arial"/>
+                <w:sz w:val="17"/>
+              </w:rPr>
               <w:t>Waimate River</w:t>
+            </w:r>
+            <w:r>
+              <w:t xml:space="preserve"> (wai-MAH-teh)</w:t>
             </w:r>
           </w:p>
         </w:tc>
@@ -3967,6 +4818,9 @@
               </w:rPr>
               <w:t>Ailani</w:t>
             </w:r>
+            <w:r>
+              <w:t xml:space="preserve"> (ai-LAH-nee)</w:t>
+            </w:r>
           </w:p>
         </w:tc>
         <w:tc>
@@ -4005,6 +4859,9 @@
               </w:rPr>
               <w:t>Arahuta</w:t>
             </w:r>
+            <w:r>
+              <w:t xml:space="preserve"> (ah-rah-HOO-tah)</w:t>
+            </w:r>
           </w:p>
         </w:tc>
         <w:tc>
@@ -4043,6 +4900,9 @@
               </w:rPr>
               <w:t>Baby Eater</w:t>
             </w:r>
+            <w:r>
+              <w:t xml:space="preserve"> (BAY-bee EE-ter)</w:t>
+            </w:r>
           </w:p>
         </w:tc>
         <w:tc>
@@ -4081,6 +4941,9 @@
               </w:rPr>
               <w:t>Chief Kuanua</w:t>
             </w:r>
+            <w:r>
+              <w:t xml:space="preserve"> (koo-AH-noo-ah)</w:t>
+            </w:r>
           </w:p>
         </w:tc>
         <w:tc>
@@ -4119,6 +4982,9 @@
               </w:rPr>
               <w:t>Dark Flame</w:t>
             </w:r>
+            <w:r>
+              <w:t xml:space="preserve"> (English)</w:t>
+            </w:r>
           </w:p>
         </w:tc>
         <w:tc>
@@ -4157,6 +5023,9 @@
               </w:rPr>
               <w:t>Faturaki</w:t>
             </w:r>
+            <w:r>
+              <w:t xml:space="preserve"> (fah-too-RAH-kee)</w:t>
+            </w:r>
           </w:p>
         </w:tc>
         <w:tc>
@@ -4195,6 +5064,9 @@
               </w:rPr>
               <w:t>Galaiga</w:t>
             </w:r>
+            <w:r>
+              <w:t xml:space="preserve"> (gah-LAI-gah)</w:t>
+            </w:r>
           </w:p>
         </w:tc>
         <w:tc>
@@ -4233,6 +5105,9 @@
               </w:rPr>
               <w:t>Gundaidhar</w:t>
             </w:r>
+            <w:r>
+              <w:t xml:space="preserve"> (gun-DYE-dar)</w:t>
+            </w:r>
           </w:p>
         </w:tc>
         <w:tc>
@@ -4271,6 +5146,9 @@
               </w:rPr>
               <w:t>Hina</w:t>
             </w:r>
+            <w:r>
+              <w:t xml:space="preserve"> (HEE-nah)</w:t>
+            </w:r>
           </w:p>
         </w:tc>
         <w:tc>
@@ -4309,6 +5187,9 @@
               </w:rPr>
               <w:t>Ho</w:t>
             </w:r>
+            <w:r>
+              <w:t xml:space="preserve"> (HOH)</w:t>
+            </w:r>
           </w:p>
         </w:tc>
         <w:tc>
@@ -4347,6 +5228,9 @@
               </w:rPr>
               <w:t>Hōkūleʻa</w:t>
             </w:r>
+            <w:r>
+              <w:t xml:space="preserve"> (HOH-koo-LEH-ah)</w:t>
+            </w:r>
           </w:p>
         </w:tc>
         <w:tc>
@@ -4385,6 +5269,9 @@
               </w:rPr>
               <w:t>Hōkūpaʻa</w:t>
             </w:r>
+            <w:r>
+              <w:t xml:space="preserve"> (HOH-koo-PAH-ah)</w:t>
+            </w:r>
           </w:p>
         </w:tc>
         <w:tc>
@@ -4423,6 +5310,9 @@
               </w:rPr>
               <w:t>Iwa</w:t>
             </w:r>
+            <w:r>
+              <w:t xml:space="preserve"> (EE-wah)</w:t>
+            </w:r>
           </w:p>
         </w:tc>
         <w:tc>
@@ -4461,6 +5351,9 @@
               </w:rPr>
               <w:t>Kalapa</w:t>
             </w:r>
+            <w:r>
+              <w:t xml:space="preserve"> (kah-LAH-pah)</w:t>
+            </w:r>
           </w:p>
         </w:tc>
         <w:tc>
@@ -4499,6 +5392,9 @@
               </w:rPr>
               <w:t>Kanopolu</w:t>
             </w:r>
+            <w:r>
+              <w:t xml:space="preserve"> (kah-noh-POH-loo)</w:t>
+            </w:r>
           </w:p>
         </w:tc>
         <w:tc>
@@ -4537,6 +5433,9 @@
               </w:rPr>
               <w:t>Kura</w:t>
             </w:r>
+            <w:r>
+              <w:t xml:space="preserve"> (KOO-rah)</w:t>
+            </w:r>
           </w:p>
         </w:tc>
         <w:tc>
@@ -4575,6 +5474,9 @@
               </w:rPr>
               <w:t>Loha</w:t>
             </w:r>
+            <w:r>
+              <w:t xml:space="preserve"> (LOH-hah)</w:t>
+            </w:r>
           </w:p>
         </w:tc>
         <w:tc>
@@ -4613,6 +5515,9 @@
               </w:rPr>
               <w:t>Makosai</w:t>
             </w:r>
+            <w:r>
+              <w:t xml:space="preserve"> (mah-KOH-sai)</w:t>
+            </w:r>
           </w:p>
         </w:tc>
         <w:tc>
@@ -4651,6 +5556,9 @@
               </w:rPr>
               <w:t>Manōkalanipō</w:t>
             </w:r>
+            <w:r>
+              <w:t xml:space="preserve"> (mah-NOH-kah-lah-nee-POH)</w:t>
+            </w:r>
           </w:p>
         </w:tc>
         <w:tc>
@@ -4689,6 +5597,9 @@
               </w:rPr>
               <w:t>Paiʻea</w:t>
             </w:r>
+            <w:r>
+              <w:t xml:space="preserve"> (pai-EH-ah)</w:t>
+            </w:r>
           </w:p>
         </w:tc>
         <w:tc>
@@ -4727,6 +5638,9 @@
               </w:rPr>
               <w:t>Pakuu</w:t>
             </w:r>
+            <w:r>
+              <w:t xml:space="preserve"> (pah-KOO-oo)</w:t>
+            </w:r>
           </w:p>
         </w:tc>
         <w:tc>
@@ -4765,6 +5679,9 @@
               </w:rPr>
               <w:t>Pataru</w:t>
             </w:r>
+            <w:r>
+              <w:t xml:space="preserve"> (pah-TAH-roo)</w:t>
+            </w:r>
           </w:p>
         </w:tc>
         <w:tc>
@@ -4803,6 +5720,9 @@
               </w:rPr>
               <w:t>Pounamu</w:t>
             </w:r>
+            <w:r>
+              <w:t xml:space="preserve"> (poh-NAH-moo)</w:t>
+            </w:r>
           </w:p>
         </w:tc>
         <w:tc>
@@ -4841,6 +5761,9 @@
               </w:rPr>
               <w:t>Selai</w:t>
             </w:r>
+            <w:r>
+              <w:t xml:space="preserve"> (SEH-lai)</w:t>
+            </w:r>
           </w:p>
         </w:tc>
         <w:tc>
@@ -4879,6 +5802,9 @@
               </w:rPr>
               <w:t>Sere</w:t>
             </w:r>
+            <w:r>
+              <w:t xml:space="preserve"> (SEH-reh)</w:t>
+            </w:r>
           </w:p>
         </w:tc>
         <w:tc>
@@ -4917,6 +5843,9 @@
               </w:rPr>
               <w:t>Sukey</w:t>
             </w:r>
+            <w:r>
+              <w:t xml:space="preserve"> (SOO-kee)</w:t>
+            </w:r>
           </w:p>
         </w:tc>
         <w:tc>
@@ -4955,6 +5884,9 @@
               </w:rPr>
               <w:t>Teā</w:t>
             </w:r>
+            <w:r>
+              <w:t xml:space="preserve"> (TEH-ah)</w:t>
+            </w:r>
           </w:p>
         </w:tc>
         <w:tc>
@@ -4993,6 +5925,9 @@
               </w:rPr>
               <w:t>Totokona</w:t>
             </w:r>
+            <w:r>
+              <w:t xml:space="preserve"> (toh-toh-KOH-nah)</w:t>
+            </w:r>
           </w:p>
         </w:tc>
         <w:tc>
@@ -5031,6 +5966,9 @@
               </w:rPr>
               <w:t>Tufukia</w:t>
             </w:r>
+            <w:r>
+              <w:t xml:space="preserve"> (too-foo-KEE-ah)</w:t>
+            </w:r>
           </w:p>
         </w:tc>
         <w:tc>
@@ -5069,6 +6007,9 @@
               </w:rPr>
               <w:t>Turuturu</w:t>
             </w:r>
+            <w:r>
+              <w:t xml:space="preserve"> (too-roo-TOO-roo)</w:t>
+            </w:r>
           </w:p>
         </w:tc>
         <w:tc>
@@ -5107,6 +6048,9 @@
               </w:rPr>
               <w:t>Tuʻunaga</w:t>
             </w:r>
+            <w:r>
+              <w:t xml:space="preserve"> (too-oo-NAH-gah)</w:t>
+            </w:r>
           </w:p>
         </w:tc>
         <w:tc>
@@ -5144,6 +6088,9 @@
                 <w:sz w:val="17"/>
               </w:rPr>
               <w:t>Waru</w:t>
+            </w:r>
+            <w:r>
+              <w:t xml:space="preserve"> (WAH-roo)</w:t>
             </w:r>
           </w:p>
         </w:tc>

</xml_diff>